<commit_message>
Run every defense on one call in the demo and report which got the correct answer
- defense.py: ALL_DEFENSES and answer_all (retrieve the 20 candidates once, give each
  defense what the sweeps give it, so answers share cache keys with results.csv)
- app.py: one "Run all defenses" button replaces the defense dropdown, the three buttons
  and the three columns; progress bar while defenses run (voting is the slow one); report
  with the correct answer, which defenses returned it and which did not, plus a table
- test_answer_all (stub reader); offline check: 84 of 84 comparable answers equal the
  sweep rows; live endpoint checked through gradio_client
- README, PROGRESS.md and the report text (abstract, objective, FR9, UC1-UC3, tests,
  schedule, sizes, Annexure I) updated; Fig. 1.1/6.2/6.3/6.4/6.7 images not redrawn

Co-Authored-By: Claude Sonnet 5.5 <noreply@anthropic.com>
</commit_message>
<xml_diff>
--- a/R2-Project-Report.docx
+++ b/R2-Project-Report.docx
@@ -1306,7 +1306,7 @@
       <w:pPr>
         <w:pStyle w:val="RPrelimTitle"/>
       </w:pPr>
-      <w:bookmarkStart w:id="0" w:name="_Toc244368872"/>
+      <w:bookmarkStart w:id="0" w:name="_Toc244369898"/>
       <w:r>
         <w:lastRenderedPageBreak/>
         <w:t>DEDICATION</w:t>
@@ -1329,7 +1329,7 @@
       <w:pPr>
         <w:pStyle w:val="RPrelimTitle"/>
       </w:pPr>
-      <w:bookmarkStart w:id="1" w:name="_Toc244368873"/>
+      <w:bookmarkStart w:id="1" w:name="_Toc244369899"/>
       <w:r>
         <w:lastRenderedPageBreak/>
         <w:t>ABSTRACT</w:t>
@@ -1341,7 +1341,7 @@
         <w:pStyle w:val="RBody"/>
       </w:pPr>
       <w:r>
-        <w:t>Retrieval-augmented generation (RAG) lets a language model answer from documents fetched at query time, which makes the document collection itself an attack surface. This project builds a laptop-scale testbed to measure how easily an attacker who can add documents to the collection can change the answers of a RAG system, and how well simple defenses hold up. The system indexes 125 Wikipedia articles on chemical elements (3,799 chunks) with the MiniLM embedding model and answers 50 factual questions with a 4-bit Qwen2.5-3B-Instruct reader that runs on a 6 GB GPU. Clean accuracy is 94%. A hand-written set of 500 poison documents (ten per question, three writing styles) is injected under the spoofed title of the true source article. A single poison document changes 58% of answers to the attacker's chosen value, three change 84% and ten change 96%, while the poison reaches the top five retrieved chunks in every case. A provenance defense that drops retrieved chunks too short to be genuine ingest chunks reduces the attack success rate to 0% with no loss of clean accuracy, whereas an isolate-then-aggregate voting defense loses 22 points of clean accuracy and fails once poison forms the majority. An adaptive attacker who pads the poison with genuine article sentences restores the attack success rate to between 56% and 94% against the provenance defense, showing that the filter exploits an artefact of the poison set rather than a robust property. A content-hash manifest of the chunks produced at ingest, which checks where a chunk came from rather than what it looks like, keeps clean accuracy at 94% and holds the attack success rate at 0% against both short and padded poison, and a graded series of provenance cut-offs (10, 20, 30 and 40 words) shows the length filter's protection falling away stepwise as the cut-off is lowered. The strongest attacker copies a genuine chunk and swaps only the answer, so the poison is full length and every other fact in it is true; it is weaker than the stubs at one document (ASR 20%) but reaches 78% at ten, and the provenance filters do not stop it. The manifest again gives 0%, as does an earliest-ingest-wins rule that keeps the first-ingested member of each group of near-duplicate chunks of one article; a near-duplicate detector that abstains also gives 0%, but only by declining to answer (96% to 100% of questions). All of these assume that the poison is injected after ingest. A Gradio application replays the clean, poisoned and defended runs interactively, with a choice of attacker and defense.</w:t>
+        <w:t>Retrieval-augmented generation (RAG) lets a language model answer from documents fetched at query time, which makes the document collection itself an attack surface. This project builds a laptop-scale testbed to measure how easily an attacker who can add documents to the collection can change the answers of a RAG system, and how well simple defenses hold up. The system indexes 125 Wikipedia articles on chemical elements (3,799 chunks) with the MiniLM embedding model and answers 50 factual questions with a 4-bit Qwen2.5-3B-Instruct reader that runs on a 6 GB GPU. Clean accuracy is 94%. A hand-written set of 500 poison documents (ten per question, three writing styles) is injected under the spoofed title of the true source article. A single poison document changes 58% of answers to the attacker's chosen value, three change 84% and ten change 96%, while the poison reaches the top five retrieved chunks in every case. A provenance defense that drops retrieved chunks too short to be genuine ingest chunks reduces the attack success rate to 0% with no loss of clean accuracy, whereas an isolate-then-aggregate voting defense loses 22 points of clean accuracy and fails once poison forms the majority. An adaptive attacker who pads the poison with genuine article sentences restores the attack success rate to between 56% and 94% against the provenance defense, showing that the filter exploits an artefact of the poison set rather than a robust property. A content-hash manifest of the chunks produced at ingest, which checks where a chunk came from rather than what it looks like, keeps clean accuracy at 94% and holds the attack success rate at 0% against both short and padded poison, and a graded series of provenance cut-offs (10, 20, 30 and 40 words) shows the length filter's protection falling away stepwise as the cut-off is lowered. The strongest attacker copies a genuine chunk and swaps only the answer, so the poison is full length and every other fact in it is true; it is weaker than the stubs at one document (ASR 20%) but reaches 78% at ten, and the provenance filters do not stop it. The manifest again gives 0%, as does an earliest-ingest-wins rule that keeps the first-ingested member of each group of near-duplicate chunks of one article; a near-duplicate detector that abstains also gives 0%, but only by declining to answer (96% to 100% of questions). All of these assume that the poison is injected after ingest. A Gradio application replays the clean and poisoned runs and, with one button, runs every defense on the same retrieved chunks and reports which of them returned the correct answer.</w:t>
       </w:r>
     </w:p>
     <w:p>
@@ -1363,7 +1363,7 @@
       <w:pPr>
         <w:pStyle w:val="RPrelimTitle"/>
       </w:pPr>
-      <w:bookmarkStart w:id="2" w:name="_Toc244368874"/>
+      <w:bookmarkStart w:id="2" w:name="_Toc244369900"/>
       <w:r>
         <w:lastRenderedPageBreak/>
         <w:t>LIST OF PUBLICATIONS</w:t>
@@ -1382,7 +1382,7 @@
       <w:pPr>
         <w:pStyle w:val="RPrelimTitle"/>
       </w:pPr>
-      <w:bookmarkStart w:id="3" w:name="_Toc244368875"/>
+      <w:bookmarkStart w:id="3" w:name="_Toc244369901"/>
       <w:r>
         <w:lastRenderedPageBreak/>
         <w:t>COPYRIGHT</w:t>
@@ -1402,7 +1402,7 @@
       <w:pPr>
         <w:pStyle w:val="RPrelimTitle"/>
       </w:pPr>
-      <w:bookmarkStart w:id="4" w:name="_Toc244368876"/>
+      <w:bookmarkStart w:id="4" w:name="_Toc244369902"/>
       <w:r>
         <w:lastRenderedPageBreak/>
         <w:t>UNDERTAKING</w:t>
@@ -1478,7 +1478,7 @@
       <w:pPr>
         <w:pStyle w:val="RPrelimTitle"/>
       </w:pPr>
-      <w:bookmarkStart w:id="5" w:name="_Toc244368877"/>
+      <w:bookmarkStart w:id="5" w:name="_Toc244369903"/>
       <w:r>
         <w:lastRenderedPageBreak/>
         <w:t>DECLARATION</w:t>
@@ -1529,7 +1529,7 @@
       <w:pPr>
         <w:pStyle w:val="RPrelimTitle"/>
       </w:pPr>
-      <w:bookmarkStart w:id="6" w:name="_Toc244368878"/>
+      <w:bookmarkStart w:id="6" w:name="_Toc244369904"/>
       <w:r>
         <w:lastRenderedPageBreak/>
         <w:t>CERTIFICATE FROM MENTOR</w:t>
@@ -1564,7 +1564,7 @@
       <w:pPr>
         <w:pStyle w:val="RPrelimTitle"/>
       </w:pPr>
-      <w:bookmarkStart w:id="7" w:name="_Toc244368879"/>
+      <w:bookmarkStart w:id="7" w:name="_Toc244369905"/>
       <w:r>
         <w:lastRenderedPageBreak/>
         <w:t>CERTIFICATE FROM COMPANY</w:t>
@@ -1583,7 +1583,7 @@
       <w:pPr>
         <w:pStyle w:val="RPrelimTitle"/>
       </w:pPr>
-      <w:bookmarkStart w:id="8" w:name="_Toc244368880"/>
+      <w:bookmarkStart w:id="8" w:name="_Toc244369906"/>
       <w:r>
         <w:lastRenderedPageBreak/>
         <w:t>PLAGIARISM CHECK CERTIFICATE FROM LIBRARY</w:t>
@@ -1674,7 +1674,7 @@
       <w:pPr>
         <w:pStyle w:val="RPrelimTitle"/>
       </w:pPr>
-      <w:bookmarkStart w:id="9" w:name="_Toc244368881"/>
+      <w:bookmarkStart w:id="9" w:name="_Toc244369907"/>
       <w:r>
         <w:lastRenderedPageBreak/>
         <w:t>ACKNOWLEDGEMENTS</w:t>
@@ -1693,7 +1693,7 @@
       <w:pPr>
         <w:pStyle w:val="RPrelimTitle"/>
       </w:pPr>
-      <w:bookmarkStart w:id="10" w:name="_Toc244368882"/>
+      <w:bookmarkStart w:id="10" w:name="_Toc244369908"/>
       <w:r>
         <w:lastRenderedPageBreak/>
         <w:t>TABLE OF CONTENTS</w:t>
@@ -1724,7 +1724,7 @@
       <w:r>
         <w:fldChar w:fldCharType="separate"/>
       </w:r>
-      <w:hyperlink w:anchor="_Toc244368872" w:history="1">
+      <w:hyperlink w:anchor="_Toc244369898" w:history="1">
         <w:r>
           <w:rPr>
             <w:rStyle w:val="Hyperlink"/>
@@ -1751,7 +1751,7 @@
             <w:noProof/>
             <w:webHidden/>
           </w:rPr>
-          <w:instrText xml:space="preserve"> PAGEREF _Toc244368872 \h </w:instrText>
+          <w:instrText xml:space="preserve"> PAGEREF _Toc244369898 \h </w:instrText>
         </w:r>
         <w:r>
           <w:rPr>
@@ -1797,7 +1797,7 @@
           <w14:ligatures w14:val="standardContextual"/>
         </w:rPr>
       </w:pPr>
-      <w:hyperlink w:anchor="_Toc244368873" w:history="1">
+      <w:hyperlink w:anchor="_Toc244369899" w:history="1">
         <w:r>
           <w:rPr>
             <w:rStyle w:val="Hyperlink"/>
@@ -1824,7 +1824,7 @@
             <w:noProof/>
             <w:webHidden/>
           </w:rPr>
-          <w:instrText xml:space="preserve"> PAGEREF _Toc244368873 \h </w:instrText>
+          <w:instrText xml:space="preserve"> PAGEREF _Toc244369899 \h </w:instrText>
         </w:r>
         <w:r>
           <w:rPr>
@@ -1870,7 +1870,7 @@
           <w14:ligatures w14:val="standardContextual"/>
         </w:rPr>
       </w:pPr>
-      <w:hyperlink w:anchor="_Toc244368874" w:history="1">
+      <w:hyperlink w:anchor="_Toc244369900" w:history="1">
         <w:r>
           <w:rPr>
             <w:rStyle w:val="Hyperlink"/>
@@ -1897,7 +1897,7 @@
             <w:noProof/>
             <w:webHidden/>
           </w:rPr>
-          <w:instrText xml:space="preserve"> PAGEREF _Toc244368874 \h </w:instrText>
+          <w:instrText xml:space="preserve"> PAGEREF _Toc244369900 \h </w:instrText>
         </w:r>
         <w:r>
           <w:rPr>
@@ -1943,7 +1943,7 @@
           <w14:ligatures w14:val="standardContextual"/>
         </w:rPr>
       </w:pPr>
-      <w:hyperlink w:anchor="_Toc244368875" w:history="1">
+      <w:hyperlink w:anchor="_Toc244369901" w:history="1">
         <w:r>
           <w:rPr>
             <w:rStyle w:val="Hyperlink"/>
@@ -1970,7 +1970,7 @@
             <w:noProof/>
             <w:webHidden/>
           </w:rPr>
-          <w:instrText xml:space="preserve"> PAGEREF _Toc244368875 \h </w:instrText>
+          <w:instrText xml:space="preserve"> PAGEREF _Toc244369901 \h </w:instrText>
         </w:r>
         <w:r>
           <w:rPr>
@@ -2016,7 +2016,7 @@
           <w14:ligatures w14:val="standardContextual"/>
         </w:rPr>
       </w:pPr>
-      <w:hyperlink w:anchor="_Toc244368876" w:history="1">
+      <w:hyperlink w:anchor="_Toc244369902" w:history="1">
         <w:r>
           <w:rPr>
             <w:rStyle w:val="Hyperlink"/>
@@ -2043,7 +2043,7 @@
             <w:noProof/>
             <w:webHidden/>
           </w:rPr>
-          <w:instrText xml:space="preserve"> PAGEREF _Toc244368876 \h </w:instrText>
+          <w:instrText xml:space="preserve"> PAGEREF _Toc244369902 \h </w:instrText>
         </w:r>
         <w:r>
           <w:rPr>
@@ -2089,7 +2089,7 @@
           <w14:ligatures w14:val="standardContextual"/>
         </w:rPr>
       </w:pPr>
-      <w:hyperlink w:anchor="_Toc244368877" w:history="1">
+      <w:hyperlink w:anchor="_Toc244369903" w:history="1">
         <w:r>
           <w:rPr>
             <w:rStyle w:val="Hyperlink"/>
@@ -2116,7 +2116,7 @@
             <w:noProof/>
             <w:webHidden/>
           </w:rPr>
-          <w:instrText xml:space="preserve"> PAGEREF _Toc244368877 \h </w:instrText>
+          <w:instrText xml:space="preserve"> PAGEREF _Toc244369903 \h </w:instrText>
         </w:r>
         <w:r>
           <w:rPr>
@@ -2162,7 +2162,7 @@
           <w14:ligatures w14:val="standardContextual"/>
         </w:rPr>
       </w:pPr>
-      <w:hyperlink w:anchor="_Toc244368878" w:history="1">
+      <w:hyperlink w:anchor="_Toc244369904" w:history="1">
         <w:r>
           <w:rPr>
             <w:rStyle w:val="Hyperlink"/>
@@ -2189,7 +2189,7 @@
             <w:noProof/>
             <w:webHidden/>
           </w:rPr>
-          <w:instrText xml:space="preserve"> PAGEREF _Toc244368878 \h </w:instrText>
+          <w:instrText xml:space="preserve"> PAGEREF _Toc244369904 \h </w:instrText>
         </w:r>
         <w:r>
           <w:rPr>
@@ -2235,7 +2235,7 @@
           <w14:ligatures w14:val="standardContextual"/>
         </w:rPr>
       </w:pPr>
-      <w:hyperlink w:anchor="_Toc244368879" w:history="1">
+      <w:hyperlink w:anchor="_Toc244369905" w:history="1">
         <w:r>
           <w:rPr>
             <w:rStyle w:val="Hyperlink"/>
@@ -2262,7 +2262,7 @@
             <w:noProof/>
             <w:webHidden/>
           </w:rPr>
-          <w:instrText xml:space="preserve"> PAGEREF _Toc244368879 \h </w:instrText>
+          <w:instrText xml:space="preserve"> PAGEREF _Toc244369905 \h </w:instrText>
         </w:r>
         <w:r>
           <w:rPr>
@@ -2308,7 +2308,7 @@
           <w14:ligatures w14:val="standardContextual"/>
         </w:rPr>
       </w:pPr>
-      <w:hyperlink w:anchor="_Toc244368880" w:history="1">
+      <w:hyperlink w:anchor="_Toc244369906" w:history="1">
         <w:r>
           <w:rPr>
             <w:rStyle w:val="Hyperlink"/>
@@ -2335,7 +2335,7 @@
             <w:noProof/>
             <w:webHidden/>
           </w:rPr>
-          <w:instrText xml:space="preserve"> PAGEREF _Toc244368880 \h </w:instrText>
+          <w:instrText xml:space="preserve"> PAGEREF _Toc244369906 \h </w:instrText>
         </w:r>
         <w:r>
           <w:rPr>
@@ -2381,7 +2381,7 @@
           <w14:ligatures w14:val="standardContextual"/>
         </w:rPr>
       </w:pPr>
-      <w:hyperlink w:anchor="_Toc244368881" w:history="1">
+      <w:hyperlink w:anchor="_Toc244369907" w:history="1">
         <w:r>
           <w:rPr>
             <w:rStyle w:val="Hyperlink"/>
@@ -2408,7 +2408,7 @@
             <w:noProof/>
             <w:webHidden/>
           </w:rPr>
-          <w:instrText xml:space="preserve"> PAGEREF _Toc244368881 \h </w:instrText>
+          <w:instrText xml:space="preserve"> PAGEREF _Toc244369907 \h </w:instrText>
         </w:r>
         <w:r>
           <w:rPr>
@@ -2454,7 +2454,7 @@
           <w14:ligatures w14:val="standardContextual"/>
         </w:rPr>
       </w:pPr>
-      <w:hyperlink w:anchor="_Toc244368882" w:history="1">
+      <w:hyperlink w:anchor="_Toc244369908" w:history="1">
         <w:r>
           <w:rPr>
             <w:rStyle w:val="Hyperlink"/>
@@ -2481,7 +2481,7 @@
             <w:noProof/>
             <w:webHidden/>
           </w:rPr>
-          <w:instrText xml:space="preserve"> PAGEREF _Toc244368882 \h </w:instrText>
+          <w:instrText xml:space="preserve"> PAGEREF _Toc244369908 \h </w:instrText>
         </w:r>
         <w:r>
           <w:rPr>
@@ -2527,7 +2527,7 @@
           <w14:ligatures w14:val="standardContextual"/>
         </w:rPr>
       </w:pPr>
-      <w:hyperlink w:anchor="_Toc244368883" w:history="1">
+      <w:hyperlink w:anchor="_Toc244369909" w:history="1">
         <w:r>
           <w:rPr>
             <w:rStyle w:val="Hyperlink"/>
@@ -2554,7 +2554,7 @@
             <w:noProof/>
             <w:webHidden/>
           </w:rPr>
-          <w:instrText xml:space="preserve"> PAGEREF _Toc244368883 \h </w:instrText>
+          <w:instrText xml:space="preserve"> PAGEREF _Toc244369909 \h </w:instrText>
         </w:r>
         <w:r>
           <w:rPr>
@@ -2600,7 +2600,7 @@
           <w14:ligatures w14:val="standardContextual"/>
         </w:rPr>
       </w:pPr>
-      <w:hyperlink w:anchor="_Toc244368884" w:history="1">
+      <w:hyperlink w:anchor="_Toc244369910" w:history="1">
         <w:r>
           <w:rPr>
             <w:rStyle w:val="Hyperlink"/>
@@ -2627,7 +2627,7 @@
             <w:noProof/>
             <w:webHidden/>
           </w:rPr>
-          <w:instrText xml:space="preserve"> PAGEREF _Toc244368884 \h </w:instrText>
+          <w:instrText xml:space="preserve"> PAGEREF _Toc244369910 \h </w:instrText>
         </w:r>
         <w:r>
           <w:rPr>
@@ -2673,7 +2673,7 @@
           <w14:ligatures w14:val="standardContextual"/>
         </w:rPr>
       </w:pPr>
-      <w:hyperlink w:anchor="_Toc244368885" w:history="1">
+      <w:hyperlink w:anchor="_Toc244369911" w:history="1">
         <w:r>
           <w:rPr>
             <w:rStyle w:val="Hyperlink"/>
@@ -2700,7 +2700,7 @@
             <w:noProof/>
             <w:webHidden/>
           </w:rPr>
-          <w:instrText xml:space="preserve"> PAGEREF _Toc244368885 \h </w:instrText>
+          <w:instrText xml:space="preserve"> PAGEREF _Toc244369911 \h </w:instrText>
         </w:r>
         <w:r>
           <w:rPr>
@@ -2746,7 +2746,7 @@
           <w14:ligatures w14:val="standardContextual"/>
         </w:rPr>
       </w:pPr>
-      <w:hyperlink w:anchor="_Toc244368886" w:history="1">
+      <w:hyperlink w:anchor="_Toc244369912" w:history="1">
         <w:r>
           <w:rPr>
             <w:rStyle w:val="Hyperlink"/>
@@ -2773,7 +2773,7 @@
             <w:noProof/>
             <w:webHidden/>
           </w:rPr>
-          <w:instrText xml:space="preserve"> PAGEREF _Toc244368886 \h </w:instrText>
+          <w:instrText xml:space="preserve"> PAGEREF _Toc244369912 \h </w:instrText>
         </w:r>
         <w:r>
           <w:rPr>
@@ -2819,7 +2819,7 @@
           <w14:ligatures w14:val="standardContextual"/>
         </w:rPr>
       </w:pPr>
-      <w:hyperlink w:anchor="_Toc244368887" w:history="1">
+      <w:hyperlink w:anchor="_Toc244369913" w:history="1">
         <w:r>
           <w:rPr>
             <w:rStyle w:val="Hyperlink"/>
@@ -2846,7 +2846,7 @@
             <w:noProof/>
             <w:webHidden/>
           </w:rPr>
-          <w:instrText xml:space="preserve"> PAGEREF _Toc244368887 \h </w:instrText>
+          <w:instrText xml:space="preserve"> PAGEREF _Toc244369913 \h </w:instrText>
         </w:r>
         <w:r>
           <w:rPr>
@@ -2892,7 +2892,7 @@
           <w14:ligatures w14:val="standardContextual"/>
         </w:rPr>
       </w:pPr>
-      <w:hyperlink w:anchor="_Toc244368888" w:history="1">
+      <w:hyperlink w:anchor="_Toc244369914" w:history="1">
         <w:r>
           <w:rPr>
             <w:rStyle w:val="Hyperlink"/>
@@ -2919,7 +2919,7 @@
             <w:noProof/>
             <w:webHidden/>
           </w:rPr>
-          <w:instrText xml:space="preserve"> PAGEREF _Toc244368888 \h </w:instrText>
+          <w:instrText xml:space="preserve"> PAGEREF _Toc244369914 \h </w:instrText>
         </w:r>
         <w:r>
           <w:rPr>
@@ -2965,7 +2965,7 @@
           <w14:ligatures w14:val="standardContextual"/>
         </w:rPr>
       </w:pPr>
-      <w:hyperlink w:anchor="_Toc244368889" w:history="1">
+      <w:hyperlink w:anchor="_Toc244369915" w:history="1">
         <w:r>
           <w:rPr>
             <w:rStyle w:val="Hyperlink"/>
@@ -2992,7 +2992,7 @@
             <w:noProof/>
             <w:webHidden/>
           </w:rPr>
-          <w:instrText xml:space="preserve"> PAGEREF _Toc244368889 \h </w:instrText>
+          <w:instrText xml:space="preserve"> PAGEREF _Toc244369915 \h </w:instrText>
         </w:r>
         <w:r>
           <w:rPr>
@@ -3038,7 +3038,7 @@
           <w14:ligatures w14:val="standardContextual"/>
         </w:rPr>
       </w:pPr>
-      <w:hyperlink w:anchor="_Toc244368890" w:history="1">
+      <w:hyperlink w:anchor="_Toc244369916" w:history="1">
         <w:r>
           <w:rPr>
             <w:rStyle w:val="Hyperlink"/>
@@ -3065,7 +3065,7 @@
             <w:noProof/>
             <w:webHidden/>
           </w:rPr>
-          <w:instrText xml:space="preserve"> PAGEREF _Toc244368890 \h </w:instrText>
+          <w:instrText xml:space="preserve"> PAGEREF _Toc244369916 \h </w:instrText>
         </w:r>
         <w:r>
           <w:rPr>
@@ -3111,7 +3111,7 @@
           <w14:ligatures w14:val="standardContextual"/>
         </w:rPr>
       </w:pPr>
-      <w:hyperlink w:anchor="_Toc244368891" w:history="1">
+      <w:hyperlink w:anchor="_Toc244369917" w:history="1">
         <w:r>
           <w:rPr>
             <w:rStyle w:val="Hyperlink"/>
@@ -3138,7 +3138,7 @@
             <w:noProof/>
             <w:webHidden/>
           </w:rPr>
-          <w:instrText xml:space="preserve"> PAGEREF _Toc244368891 \h </w:instrText>
+          <w:instrText xml:space="preserve"> PAGEREF _Toc244369917 \h </w:instrText>
         </w:r>
         <w:r>
           <w:rPr>
@@ -3184,7 +3184,7 @@
           <w14:ligatures w14:val="standardContextual"/>
         </w:rPr>
       </w:pPr>
-      <w:hyperlink w:anchor="_Toc244368892" w:history="1">
+      <w:hyperlink w:anchor="_Toc244369918" w:history="1">
         <w:r>
           <w:rPr>
             <w:rStyle w:val="Hyperlink"/>
@@ -3211,7 +3211,7 @@
             <w:noProof/>
             <w:webHidden/>
           </w:rPr>
-          <w:instrText xml:space="preserve"> PAGEREF _Toc244368892 \h </w:instrText>
+          <w:instrText xml:space="preserve"> PAGEREF _Toc244369918 \h </w:instrText>
         </w:r>
         <w:r>
           <w:rPr>
@@ -3257,7 +3257,7 @@
           <w14:ligatures w14:val="standardContextual"/>
         </w:rPr>
       </w:pPr>
-      <w:hyperlink w:anchor="_Toc244368893" w:history="1">
+      <w:hyperlink w:anchor="_Toc244369919" w:history="1">
         <w:r>
           <w:rPr>
             <w:rStyle w:val="Hyperlink"/>
@@ -3284,7 +3284,7 @@
             <w:noProof/>
             <w:webHidden/>
           </w:rPr>
-          <w:instrText xml:space="preserve"> PAGEREF _Toc244368893 \h </w:instrText>
+          <w:instrText xml:space="preserve"> PAGEREF _Toc244369919 \h </w:instrText>
         </w:r>
         <w:r>
           <w:rPr>
@@ -3330,7 +3330,7 @@
           <w14:ligatures w14:val="standardContextual"/>
         </w:rPr>
       </w:pPr>
-      <w:hyperlink w:anchor="_Toc244368894" w:history="1">
+      <w:hyperlink w:anchor="_Toc244369920" w:history="1">
         <w:r>
           <w:rPr>
             <w:rStyle w:val="Hyperlink"/>
@@ -3357,7 +3357,7 @@
             <w:noProof/>
             <w:webHidden/>
           </w:rPr>
-          <w:instrText xml:space="preserve"> PAGEREF _Toc244368894 \h </w:instrText>
+          <w:instrText xml:space="preserve"> PAGEREF _Toc244369920 \h </w:instrText>
         </w:r>
         <w:r>
           <w:rPr>
@@ -3403,7 +3403,7 @@
           <w14:ligatures w14:val="standardContextual"/>
         </w:rPr>
       </w:pPr>
-      <w:hyperlink w:anchor="_Toc244368895" w:history="1">
+      <w:hyperlink w:anchor="_Toc244369921" w:history="1">
         <w:r>
           <w:rPr>
             <w:rStyle w:val="Hyperlink"/>
@@ -3430,7 +3430,7 @@
             <w:noProof/>
             <w:webHidden/>
           </w:rPr>
-          <w:instrText xml:space="preserve"> PAGEREF _Toc244368895 \h </w:instrText>
+          <w:instrText xml:space="preserve"> PAGEREF _Toc244369921 \h </w:instrText>
         </w:r>
         <w:r>
           <w:rPr>
@@ -3476,7 +3476,7 @@
           <w14:ligatures w14:val="standardContextual"/>
         </w:rPr>
       </w:pPr>
-      <w:hyperlink w:anchor="_Toc244368896" w:history="1">
+      <w:hyperlink w:anchor="_Toc244369922" w:history="1">
         <w:r>
           <w:rPr>
             <w:rStyle w:val="Hyperlink"/>
@@ -3503,7 +3503,7 @@
             <w:noProof/>
             <w:webHidden/>
           </w:rPr>
-          <w:instrText xml:space="preserve"> PAGEREF _Toc244368896 \h </w:instrText>
+          <w:instrText xml:space="preserve"> PAGEREF _Toc244369922 \h </w:instrText>
         </w:r>
         <w:r>
           <w:rPr>
@@ -3549,7 +3549,7 @@
           <w14:ligatures w14:val="standardContextual"/>
         </w:rPr>
       </w:pPr>
-      <w:hyperlink w:anchor="_Toc244368897" w:history="1">
+      <w:hyperlink w:anchor="_Toc244369923" w:history="1">
         <w:r>
           <w:rPr>
             <w:rStyle w:val="Hyperlink"/>
@@ -3576,7 +3576,7 @@
             <w:noProof/>
             <w:webHidden/>
           </w:rPr>
-          <w:instrText xml:space="preserve"> PAGEREF _Toc244368897 \h </w:instrText>
+          <w:instrText xml:space="preserve"> PAGEREF _Toc244369923 \h </w:instrText>
         </w:r>
         <w:r>
           <w:rPr>
@@ -3622,7 +3622,7 @@
           <w14:ligatures w14:val="standardContextual"/>
         </w:rPr>
       </w:pPr>
-      <w:hyperlink w:anchor="_Toc244368898" w:history="1">
+      <w:hyperlink w:anchor="_Toc244369924" w:history="1">
         <w:r>
           <w:rPr>
             <w:rStyle w:val="Hyperlink"/>
@@ -3649,7 +3649,7 @@
             <w:noProof/>
             <w:webHidden/>
           </w:rPr>
-          <w:instrText xml:space="preserve"> PAGEREF _Toc244368898 \h </w:instrText>
+          <w:instrText xml:space="preserve"> PAGEREF _Toc244369924 \h </w:instrText>
         </w:r>
         <w:r>
           <w:rPr>
@@ -3695,7 +3695,7 @@
           <w14:ligatures w14:val="standardContextual"/>
         </w:rPr>
       </w:pPr>
-      <w:hyperlink w:anchor="_Toc244368899" w:history="1">
+      <w:hyperlink w:anchor="_Toc244369925" w:history="1">
         <w:r>
           <w:rPr>
             <w:rStyle w:val="Hyperlink"/>
@@ -3722,7 +3722,7 @@
             <w:noProof/>
             <w:webHidden/>
           </w:rPr>
-          <w:instrText xml:space="preserve"> PAGEREF _Toc244368899 \h </w:instrText>
+          <w:instrText xml:space="preserve"> PAGEREF _Toc244369925 \h </w:instrText>
         </w:r>
         <w:r>
           <w:rPr>
@@ -3768,7 +3768,7 @@
           <w14:ligatures w14:val="standardContextual"/>
         </w:rPr>
       </w:pPr>
-      <w:hyperlink w:anchor="_Toc244368900" w:history="1">
+      <w:hyperlink w:anchor="_Toc244369926" w:history="1">
         <w:r>
           <w:rPr>
             <w:rStyle w:val="Hyperlink"/>
@@ -3795,7 +3795,7 @@
             <w:noProof/>
             <w:webHidden/>
           </w:rPr>
-          <w:instrText xml:space="preserve"> PAGEREF _Toc244368900 \h </w:instrText>
+          <w:instrText xml:space="preserve"> PAGEREF _Toc244369926 \h </w:instrText>
         </w:r>
         <w:r>
           <w:rPr>
@@ -3841,7 +3841,7 @@
           <w14:ligatures w14:val="standardContextual"/>
         </w:rPr>
       </w:pPr>
-      <w:hyperlink w:anchor="_Toc244368901" w:history="1">
+      <w:hyperlink w:anchor="_Toc244369927" w:history="1">
         <w:r>
           <w:rPr>
             <w:rStyle w:val="Hyperlink"/>
@@ -3868,7 +3868,7 @@
             <w:noProof/>
             <w:webHidden/>
           </w:rPr>
-          <w:instrText xml:space="preserve"> PAGEREF _Toc244368901 \h </w:instrText>
+          <w:instrText xml:space="preserve"> PAGEREF _Toc244369927 \h </w:instrText>
         </w:r>
         <w:r>
           <w:rPr>
@@ -3914,7 +3914,7 @@
           <w14:ligatures w14:val="standardContextual"/>
         </w:rPr>
       </w:pPr>
-      <w:hyperlink w:anchor="_Toc244368902" w:history="1">
+      <w:hyperlink w:anchor="_Toc244369928" w:history="1">
         <w:r>
           <w:rPr>
             <w:rStyle w:val="Hyperlink"/>
@@ -3941,7 +3941,7 @@
             <w:noProof/>
             <w:webHidden/>
           </w:rPr>
-          <w:instrText xml:space="preserve"> PAGEREF _Toc244368902 \h </w:instrText>
+          <w:instrText xml:space="preserve"> PAGEREF _Toc244369928 \h </w:instrText>
         </w:r>
         <w:r>
           <w:rPr>
@@ -3987,7 +3987,7 @@
           <w14:ligatures w14:val="standardContextual"/>
         </w:rPr>
       </w:pPr>
-      <w:hyperlink w:anchor="_Toc244368903" w:history="1">
+      <w:hyperlink w:anchor="_Toc244369929" w:history="1">
         <w:r>
           <w:rPr>
             <w:rStyle w:val="Hyperlink"/>
@@ -4014,7 +4014,7 @@
             <w:noProof/>
             <w:webHidden/>
           </w:rPr>
-          <w:instrText xml:space="preserve"> PAGEREF _Toc244368903 \h </w:instrText>
+          <w:instrText xml:space="preserve"> PAGEREF _Toc244369929 \h </w:instrText>
         </w:r>
         <w:r>
           <w:rPr>
@@ -4060,7 +4060,7 @@
           <w14:ligatures w14:val="standardContextual"/>
         </w:rPr>
       </w:pPr>
-      <w:hyperlink w:anchor="_Toc244368904" w:history="1">
+      <w:hyperlink w:anchor="_Toc244369930" w:history="1">
         <w:r>
           <w:rPr>
             <w:rStyle w:val="Hyperlink"/>
@@ -4087,7 +4087,7 @@
             <w:noProof/>
             <w:webHidden/>
           </w:rPr>
-          <w:instrText xml:space="preserve"> PAGEREF _Toc244368904 \h </w:instrText>
+          <w:instrText xml:space="preserve"> PAGEREF _Toc244369930 \h </w:instrText>
         </w:r>
         <w:r>
           <w:rPr>
@@ -4133,7 +4133,7 @@
           <w14:ligatures w14:val="standardContextual"/>
         </w:rPr>
       </w:pPr>
-      <w:hyperlink w:anchor="_Toc244368905" w:history="1">
+      <w:hyperlink w:anchor="_Toc244369931" w:history="1">
         <w:r>
           <w:rPr>
             <w:rStyle w:val="Hyperlink"/>
@@ -4160,7 +4160,7 @@
             <w:noProof/>
             <w:webHidden/>
           </w:rPr>
-          <w:instrText xml:space="preserve"> PAGEREF _Toc244368905 \h </w:instrText>
+          <w:instrText xml:space="preserve"> PAGEREF _Toc244369931 \h </w:instrText>
         </w:r>
         <w:r>
           <w:rPr>
@@ -4206,7 +4206,7 @@
           <w14:ligatures w14:val="standardContextual"/>
         </w:rPr>
       </w:pPr>
-      <w:hyperlink w:anchor="_Toc244368906" w:history="1">
+      <w:hyperlink w:anchor="_Toc244369932" w:history="1">
         <w:r>
           <w:rPr>
             <w:rStyle w:val="Hyperlink"/>
@@ -4233,7 +4233,7 @@
             <w:noProof/>
             <w:webHidden/>
           </w:rPr>
-          <w:instrText xml:space="preserve"> PAGEREF _Toc244368906 \h </w:instrText>
+          <w:instrText xml:space="preserve"> PAGEREF _Toc244369932 \h </w:instrText>
         </w:r>
         <w:r>
           <w:rPr>
@@ -4279,7 +4279,7 @@
           <w14:ligatures w14:val="standardContextual"/>
         </w:rPr>
       </w:pPr>
-      <w:hyperlink w:anchor="_Toc244368907" w:history="1">
+      <w:hyperlink w:anchor="_Toc244369933" w:history="1">
         <w:r>
           <w:rPr>
             <w:rStyle w:val="Hyperlink"/>
@@ -4306,7 +4306,7 @@
             <w:noProof/>
             <w:webHidden/>
           </w:rPr>
-          <w:instrText xml:space="preserve"> PAGEREF _Toc244368907 \h </w:instrText>
+          <w:instrText xml:space="preserve"> PAGEREF _Toc244369933 \h </w:instrText>
         </w:r>
         <w:r>
           <w:rPr>
@@ -4352,7 +4352,7 @@
           <w14:ligatures w14:val="standardContextual"/>
         </w:rPr>
       </w:pPr>
-      <w:hyperlink w:anchor="_Toc244368908" w:history="1">
+      <w:hyperlink w:anchor="_Toc244369934" w:history="1">
         <w:r>
           <w:rPr>
             <w:rStyle w:val="Hyperlink"/>
@@ -4379,7 +4379,7 @@
             <w:noProof/>
             <w:webHidden/>
           </w:rPr>
-          <w:instrText xml:space="preserve"> PAGEREF _Toc244368908 \h </w:instrText>
+          <w:instrText xml:space="preserve"> PAGEREF _Toc244369934 \h </w:instrText>
         </w:r>
         <w:r>
           <w:rPr>
@@ -4425,7 +4425,7 @@
           <w14:ligatures w14:val="standardContextual"/>
         </w:rPr>
       </w:pPr>
-      <w:hyperlink w:anchor="_Toc244368909" w:history="1">
+      <w:hyperlink w:anchor="_Toc244369935" w:history="1">
         <w:r>
           <w:rPr>
             <w:rStyle w:val="Hyperlink"/>
@@ -4452,7 +4452,7 @@
             <w:noProof/>
             <w:webHidden/>
           </w:rPr>
-          <w:instrText xml:space="preserve"> PAGEREF _Toc244368909 \h </w:instrText>
+          <w:instrText xml:space="preserve"> PAGEREF _Toc244369935 \h </w:instrText>
         </w:r>
         <w:r>
           <w:rPr>
@@ -4498,7 +4498,7 @@
           <w14:ligatures w14:val="standardContextual"/>
         </w:rPr>
       </w:pPr>
-      <w:hyperlink w:anchor="_Toc244368910" w:history="1">
+      <w:hyperlink w:anchor="_Toc244369936" w:history="1">
         <w:r>
           <w:rPr>
             <w:rStyle w:val="Hyperlink"/>
@@ -4525,7 +4525,7 @@
             <w:noProof/>
             <w:webHidden/>
           </w:rPr>
-          <w:instrText xml:space="preserve"> PAGEREF _Toc244368910 \h </w:instrText>
+          <w:instrText xml:space="preserve"> PAGEREF _Toc244369936 \h </w:instrText>
         </w:r>
         <w:r>
           <w:rPr>
@@ -4571,7 +4571,7 @@
           <w14:ligatures w14:val="standardContextual"/>
         </w:rPr>
       </w:pPr>
-      <w:hyperlink w:anchor="_Toc244368911" w:history="1">
+      <w:hyperlink w:anchor="_Toc244369937" w:history="1">
         <w:r>
           <w:rPr>
             <w:rStyle w:val="Hyperlink"/>
@@ -4598,7 +4598,7 @@
             <w:noProof/>
             <w:webHidden/>
           </w:rPr>
-          <w:instrText xml:space="preserve"> PAGEREF _Toc244368911 \h </w:instrText>
+          <w:instrText xml:space="preserve"> PAGEREF _Toc244369937 \h </w:instrText>
         </w:r>
         <w:r>
           <w:rPr>
@@ -4644,7 +4644,7 @@
           <w14:ligatures w14:val="standardContextual"/>
         </w:rPr>
       </w:pPr>
-      <w:hyperlink w:anchor="_Toc244368912" w:history="1">
+      <w:hyperlink w:anchor="_Toc244369938" w:history="1">
         <w:r>
           <w:rPr>
             <w:rStyle w:val="Hyperlink"/>
@@ -4671,7 +4671,7 @@
             <w:noProof/>
             <w:webHidden/>
           </w:rPr>
-          <w:instrText xml:space="preserve"> PAGEREF _Toc244368912 \h </w:instrText>
+          <w:instrText xml:space="preserve"> PAGEREF _Toc244369938 \h </w:instrText>
         </w:r>
         <w:r>
           <w:rPr>
@@ -4717,7 +4717,7 @@
           <w14:ligatures w14:val="standardContextual"/>
         </w:rPr>
       </w:pPr>
-      <w:hyperlink w:anchor="_Toc244368913" w:history="1">
+      <w:hyperlink w:anchor="_Toc244369939" w:history="1">
         <w:r>
           <w:rPr>
             <w:rStyle w:val="Hyperlink"/>
@@ -4744,7 +4744,7 @@
             <w:noProof/>
             <w:webHidden/>
           </w:rPr>
-          <w:instrText xml:space="preserve"> PAGEREF _Toc244368913 \h </w:instrText>
+          <w:instrText xml:space="preserve"> PAGEREF _Toc244369939 \h </w:instrText>
         </w:r>
         <w:r>
           <w:rPr>
@@ -4790,7 +4790,7 @@
           <w14:ligatures w14:val="standardContextual"/>
         </w:rPr>
       </w:pPr>
-      <w:hyperlink w:anchor="_Toc244368914" w:history="1">
+      <w:hyperlink w:anchor="_Toc244369940" w:history="1">
         <w:r>
           <w:rPr>
             <w:rStyle w:val="Hyperlink"/>
@@ -4817,7 +4817,7 @@
             <w:noProof/>
             <w:webHidden/>
           </w:rPr>
-          <w:instrText xml:space="preserve"> PAGEREF _Toc244368914 \h </w:instrText>
+          <w:instrText xml:space="preserve"> PAGEREF _Toc244369940 \h </w:instrText>
         </w:r>
         <w:r>
           <w:rPr>
@@ -4863,7 +4863,7 @@
           <w14:ligatures w14:val="standardContextual"/>
         </w:rPr>
       </w:pPr>
-      <w:hyperlink w:anchor="_Toc244368915" w:history="1">
+      <w:hyperlink w:anchor="_Toc244369941" w:history="1">
         <w:r>
           <w:rPr>
             <w:rStyle w:val="Hyperlink"/>
@@ -4890,7 +4890,7 @@
             <w:noProof/>
             <w:webHidden/>
           </w:rPr>
-          <w:instrText xml:space="preserve"> PAGEREF _Toc244368915 \h </w:instrText>
+          <w:instrText xml:space="preserve"> PAGEREF _Toc244369941 \h </w:instrText>
         </w:r>
         <w:r>
           <w:rPr>
@@ -4936,7 +4936,7 @@
           <w14:ligatures w14:val="standardContextual"/>
         </w:rPr>
       </w:pPr>
-      <w:hyperlink w:anchor="_Toc244368916" w:history="1">
+      <w:hyperlink w:anchor="_Toc244369942" w:history="1">
         <w:r>
           <w:rPr>
             <w:rStyle w:val="Hyperlink"/>
@@ -4963,7 +4963,7 @@
             <w:noProof/>
             <w:webHidden/>
           </w:rPr>
-          <w:instrText xml:space="preserve"> PAGEREF _Toc244368916 \h </w:instrText>
+          <w:instrText xml:space="preserve"> PAGEREF _Toc244369942 \h </w:instrText>
         </w:r>
         <w:r>
           <w:rPr>
@@ -5009,7 +5009,7 @@
           <w14:ligatures w14:val="standardContextual"/>
         </w:rPr>
       </w:pPr>
-      <w:hyperlink w:anchor="_Toc244368917" w:history="1">
+      <w:hyperlink w:anchor="_Toc244369943" w:history="1">
         <w:r>
           <w:rPr>
             <w:rStyle w:val="Hyperlink"/>
@@ -5036,7 +5036,7 @@
             <w:noProof/>
             <w:webHidden/>
           </w:rPr>
-          <w:instrText xml:space="preserve"> PAGEREF _Toc244368917 \h </w:instrText>
+          <w:instrText xml:space="preserve"> PAGEREF _Toc244369943 \h </w:instrText>
         </w:r>
         <w:r>
           <w:rPr>
@@ -5082,7 +5082,7 @@
           <w14:ligatures w14:val="standardContextual"/>
         </w:rPr>
       </w:pPr>
-      <w:hyperlink w:anchor="_Toc244368918" w:history="1">
+      <w:hyperlink w:anchor="_Toc244369944" w:history="1">
         <w:r>
           <w:rPr>
             <w:rStyle w:val="Hyperlink"/>
@@ -5109,7 +5109,7 @@
             <w:noProof/>
             <w:webHidden/>
           </w:rPr>
-          <w:instrText xml:space="preserve"> PAGEREF _Toc244368918 \h </w:instrText>
+          <w:instrText xml:space="preserve"> PAGEREF _Toc244369944 \h </w:instrText>
         </w:r>
         <w:r>
           <w:rPr>
@@ -5155,7 +5155,7 @@
           <w14:ligatures w14:val="standardContextual"/>
         </w:rPr>
       </w:pPr>
-      <w:hyperlink w:anchor="_Toc244368919" w:history="1">
+      <w:hyperlink w:anchor="_Toc244369945" w:history="1">
         <w:r>
           <w:rPr>
             <w:rStyle w:val="Hyperlink"/>
@@ -5182,7 +5182,7 @@
             <w:noProof/>
             <w:webHidden/>
           </w:rPr>
-          <w:instrText xml:space="preserve"> PAGEREF _Toc244368919 \h </w:instrText>
+          <w:instrText xml:space="preserve"> PAGEREF _Toc244369945 \h </w:instrText>
         </w:r>
         <w:r>
           <w:rPr>
@@ -5228,7 +5228,7 @@
           <w14:ligatures w14:val="standardContextual"/>
         </w:rPr>
       </w:pPr>
-      <w:hyperlink w:anchor="_Toc244368920" w:history="1">
+      <w:hyperlink w:anchor="_Toc244369946" w:history="1">
         <w:r>
           <w:rPr>
             <w:rStyle w:val="Hyperlink"/>
@@ -5255,7 +5255,7 @@
             <w:noProof/>
             <w:webHidden/>
           </w:rPr>
-          <w:instrText xml:space="preserve"> PAGEREF _Toc244368920 \h </w:instrText>
+          <w:instrText xml:space="preserve"> PAGEREF _Toc244369946 \h </w:instrText>
         </w:r>
         <w:r>
           <w:rPr>
@@ -5301,7 +5301,7 @@
           <w14:ligatures w14:val="standardContextual"/>
         </w:rPr>
       </w:pPr>
-      <w:hyperlink w:anchor="_Toc244368921" w:history="1">
+      <w:hyperlink w:anchor="_Toc244369947" w:history="1">
         <w:r>
           <w:rPr>
             <w:rStyle w:val="Hyperlink"/>
@@ -5328,7 +5328,7 @@
             <w:noProof/>
             <w:webHidden/>
           </w:rPr>
-          <w:instrText xml:space="preserve"> PAGEREF _Toc244368921 \h </w:instrText>
+          <w:instrText xml:space="preserve"> PAGEREF _Toc244369947 \h </w:instrText>
         </w:r>
         <w:r>
           <w:rPr>
@@ -5374,7 +5374,7 @@
           <w14:ligatures w14:val="standardContextual"/>
         </w:rPr>
       </w:pPr>
-      <w:hyperlink w:anchor="_Toc244368922" w:history="1">
+      <w:hyperlink w:anchor="_Toc244369948" w:history="1">
         <w:r>
           <w:rPr>
             <w:rStyle w:val="Hyperlink"/>
@@ -5401,7 +5401,7 @@
             <w:noProof/>
             <w:webHidden/>
           </w:rPr>
-          <w:instrText xml:space="preserve"> PAGEREF _Toc244368922 \h </w:instrText>
+          <w:instrText xml:space="preserve"> PAGEREF _Toc244369948 \h </w:instrText>
         </w:r>
         <w:r>
           <w:rPr>
@@ -5447,7 +5447,7 @@
           <w14:ligatures w14:val="standardContextual"/>
         </w:rPr>
       </w:pPr>
-      <w:hyperlink w:anchor="_Toc244368923" w:history="1">
+      <w:hyperlink w:anchor="_Toc244369949" w:history="1">
         <w:r>
           <w:rPr>
             <w:rStyle w:val="Hyperlink"/>
@@ -5474,7 +5474,7 @@
             <w:noProof/>
             <w:webHidden/>
           </w:rPr>
-          <w:instrText xml:space="preserve"> PAGEREF _Toc244368923 \h </w:instrText>
+          <w:instrText xml:space="preserve"> PAGEREF _Toc244369949 \h </w:instrText>
         </w:r>
         <w:r>
           <w:rPr>
@@ -5520,7 +5520,7 @@
           <w14:ligatures w14:val="standardContextual"/>
         </w:rPr>
       </w:pPr>
-      <w:hyperlink w:anchor="_Toc244368924" w:history="1">
+      <w:hyperlink w:anchor="_Toc244369950" w:history="1">
         <w:r>
           <w:rPr>
             <w:rStyle w:val="Hyperlink"/>
@@ -5547,7 +5547,7 @@
             <w:noProof/>
             <w:webHidden/>
           </w:rPr>
-          <w:instrText xml:space="preserve"> PAGEREF _Toc244368924 \h </w:instrText>
+          <w:instrText xml:space="preserve"> PAGEREF _Toc244369950 \h </w:instrText>
         </w:r>
         <w:r>
           <w:rPr>
@@ -5593,7 +5593,7 @@
           <w14:ligatures w14:val="standardContextual"/>
         </w:rPr>
       </w:pPr>
-      <w:hyperlink w:anchor="_Toc244368925" w:history="1">
+      <w:hyperlink w:anchor="_Toc244369951" w:history="1">
         <w:r>
           <w:rPr>
             <w:rStyle w:val="Hyperlink"/>
@@ -5620,7 +5620,7 @@
             <w:noProof/>
             <w:webHidden/>
           </w:rPr>
-          <w:instrText xml:space="preserve"> PAGEREF _Toc244368925 \h </w:instrText>
+          <w:instrText xml:space="preserve"> PAGEREF _Toc244369951 \h </w:instrText>
         </w:r>
         <w:r>
           <w:rPr>
@@ -5666,7 +5666,7 @@
           <w14:ligatures w14:val="standardContextual"/>
         </w:rPr>
       </w:pPr>
-      <w:hyperlink w:anchor="_Toc244368926" w:history="1">
+      <w:hyperlink w:anchor="_Toc244369952" w:history="1">
         <w:r>
           <w:rPr>
             <w:rStyle w:val="Hyperlink"/>
@@ -5693,7 +5693,7 @@
             <w:noProof/>
             <w:webHidden/>
           </w:rPr>
-          <w:instrText xml:space="preserve"> PAGEREF _Toc244368926 \h </w:instrText>
+          <w:instrText xml:space="preserve"> PAGEREF _Toc244369952 \h </w:instrText>
         </w:r>
         <w:r>
           <w:rPr>
@@ -5739,7 +5739,7 @@
           <w14:ligatures w14:val="standardContextual"/>
         </w:rPr>
       </w:pPr>
-      <w:hyperlink w:anchor="_Toc244368927" w:history="1">
+      <w:hyperlink w:anchor="_Toc244369953" w:history="1">
         <w:r>
           <w:rPr>
             <w:rStyle w:val="Hyperlink"/>
@@ -5766,7 +5766,7 @@
             <w:noProof/>
             <w:webHidden/>
           </w:rPr>
-          <w:instrText xml:space="preserve"> PAGEREF _Toc244368927 \h </w:instrText>
+          <w:instrText xml:space="preserve"> PAGEREF _Toc244369953 \h </w:instrText>
         </w:r>
         <w:r>
           <w:rPr>
@@ -5812,7 +5812,7 @@
           <w14:ligatures w14:val="standardContextual"/>
         </w:rPr>
       </w:pPr>
-      <w:hyperlink w:anchor="_Toc244368928" w:history="1">
+      <w:hyperlink w:anchor="_Toc244369954" w:history="1">
         <w:r>
           <w:rPr>
             <w:rStyle w:val="Hyperlink"/>
@@ -5839,7 +5839,7 @@
             <w:noProof/>
             <w:webHidden/>
           </w:rPr>
-          <w:instrText xml:space="preserve"> PAGEREF _Toc244368928 \h </w:instrText>
+          <w:instrText xml:space="preserve"> PAGEREF _Toc244369954 \h </w:instrText>
         </w:r>
         <w:r>
           <w:rPr>
@@ -5885,7 +5885,7 @@
           <w14:ligatures w14:val="standardContextual"/>
         </w:rPr>
       </w:pPr>
-      <w:hyperlink w:anchor="_Toc244368929" w:history="1">
+      <w:hyperlink w:anchor="_Toc244369955" w:history="1">
         <w:r>
           <w:rPr>
             <w:rStyle w:val="Hyperlink"/>
@@ -5912,7 +5912,7 @@
             <w:noProof/>
             <w:webHidden/>
           </w:rPr>
-          <w:instrText xml:space="preserve"> PAGEREF _Toc244368929 \h </w:instrText>
+          <w:instrText xml:space="preserve"> PAGEREF _Toc244369955 \h </w:instrText>
         </w:r>
         <w:r>
           <w:rPr>
@@ -5958,7 +5958,7 @@
           <w14:ligatures w14:val="standardContextual"/>
         </w:rPr>
       </w:pPr>
-      <w:hyperlink w:anchor="_Toc244368930" w:history="1">
+      <w:hyperlink w:anchor="_Toc244369956" w:history="1">
         <w:r>
           <w:rPr>
             <w:rStyle w:val="Hyperlink"/>
@@ -5985,7 +5985,7 @@
             <w:noProof/>
             <w:webHidden/>
           </w:rPr>
-          <w:instrText xml:space="preserve"> PAGEREF _Toc244368930 \h </w:instrText>
+          <w:instrText xml:space="preserve"> PAGEREF _Toc244369956 \h </w:instrText>
         </w:r>
         <w:r>
           <w:rPr>
@@ -6031,7 +6031,7 @@
           <w14:ligatures w14:val="standardContextual"/>
         </w:rPr>
       </w:pPr>
-      <w:hyperlink w:anchor="_Toc244368931" w:history="1">
+      <w:hyperlink w:anchor="_Toc244369957" w:history="1">
         <w:r>
           <w:rPr>
             <w:rStyle w:val="Hyperlink"/>
@@ -6058,7 +6058,7 @@
             <w:noProof/>
             <w:webHidden/>
           </w:rPr>
-          <w:instrText xml:space="preserve"> PAGEREF _Toc244368931 \h </w:instrText>
+          <w:instrText xml:space="preserve"> PAGEREF _Toc244369957 \h </w:instrText>
         </w:r>
         <w:r>
           <w:rPr>
@@ -6104,7 +6104,7 @@
           <w14:ligatures w14:val="standardContextual"/>
         </w:rPr>
       </w:pPr>
-      <w:hyperlink w:anchor="_Toc244368932" w:history="1">
+      <w:hyperlink w:anchor="_Toc244369958" w:history="1">
         <w:r>
           <w:rPr>
             <w:rStyle w:val="Hyperlink"/>
@@ -6131,7 +6131,7 @@
             <w:noProof/>
             <w:webHidden/>
           </w:rPr>
-          <w:instrText xml:space="preserve"> PAGEREF _Toc244368932 \h </w:instrText>
+          <w:instrText xml:space="preserve"> PAGEREF _Toc244369958 \h </w:instrText>
         </w:r>
         <w:r>
           <w:rPr>
@@ -6177,7 +6177,7 @@
           <w14:ligatures w14:val="standardContextual"/>
         </w:rPr>
       </w:pPr>
-      <w:hyperlink w:anchor="_Toc244368933" w:history="1">
+      <w:hyperlink w:anchor="_Toc244369959" w:history="1">
         <w:r>
           <w:rPr>
             <w:rStyle w:val="Hyperlink"/>
@@ -6204,7 +6204,7 @@
             <w:noProof/>
             <w:webHidden/>
           </w:rPr>
-          <w:instrText xml:space="preserve"> PAGEREF _Toc244368933 \h </w:instrText>
+          <w:instrText xml:space="preserve"> PAGEREF _Toc244369959 \h </w:instrText>
         </w:r>
         <w:r>
           <w:rPr>
@@ -6250,7 +6250,7 @@
           <w14:ligatures w14:val="standardContextual"/>
         </w:rPr>
       </w:pPr>
-      <w:hyperlink w:anchor="_Toc244368934" w:history="1">
+      <w:hyperlink w:anchor="_Toc244369960" w:history="1">
         <w:r>
           <w:rPr>
             <w:rStyle w:val="Hyperlink"/>
@@ -6277,7 +6277,7 @@
             <w:noProof/>
             <w:webHidden/>
           </w:rPr>
-          <w:instrText xml:space="preserve"> PAGEREF _Toc244368934 \h </w:instrText>
+          <w:instrText xml:space="preserve"> PAGEREF _Toc244369960 \h </w:instrText>
         </w:r>
         <w:r>
           <w:rPr>
@@ -6323,7 +6323,7 @@
           <w14:ligatures w14:val="standardContextual"/>
         </w:rPr>
       </w:pPr>
-      <w:hyperlink w:anchor="_Toc244368935" w:history="1">
+      <w:hyperlink w:anchor="_Toc244369961" w:history="1">
         <w:r>
           <w:rPr>
             <w:rStyle w:val="Hyperlink"/>
@@ -6350,7 +6350,7 @@
             <w:noProof/>
             <w:webHidden/>
           </w:rPr>
-          <w:instrText xml:space="preserve"> PAGEREF _Toc244368935 \h </w:instrText>
+          <w:instrText xml:space="preserve"> PAGEREF _Toc244369961 \h </w:instrText>
         </w:r>
         <w:r>
           <w:rPr>
@@ -6396,7 +6396,7 @@
           <w14:ligatures w14:val="standardContextual"/>
         </w:rPr>
       </w:pPr>
-      <w:hyperlink w:anchor="_Toc244368936" w:history="1">
+      <w:hyperlink w:anchor="_Toc244369962" w:history="1">
         <w:r>
           <w:rPr>
             <w:rStyle w:val="Hyperlink"/>
@@ -6423,7 +6423,7 @@
             <w:noProof/>
             <w:webHidden/>
           </w:rPr>
-          <w:instrText xml:space="preserve"> PAGEREF _Toc244368936 \h </w:instrText>
+          <w:instrText xml:space="preserve"> PAGEREF _Toc244369962 \h </w:instrText>
         </w:r>
         <w:r>
           <w:rPr>
@@ -6469,7 +6469,7 @@
           <w14:ligatures w14:val="standardContextual"/>
         </w:rPr>
       </w:pPr>
-      <w:hyperlink w:anchor="_Toc244368937" w:history="1">
+      <w:hyperlink w:anchor="_Toc244369963" w:history="1">
         <w:r>
           <w:rPr>
             <w:rStyle w:val="Hyperlink"/>
@@ -6496,7 +6496,7 @@
             <w:noProof/>
             <w:webHidden/>
           </w:rPr>
-          <w:instrText xml:space="preserve"> PAGEREF _Toc244368937 \h </w:instrText>
+          <w:instrText xml:space="preserve"> PAGEREF _Toc244369963 \h </w:instrText>
         </w:r>
         <w:r>
           <w:rPr>
@@ -6516,7 +6516,7 @@
             <w:noProof/>
             <w:webHidden/>
           </w:rPr>
-          <w:t>21</w:t>
+          <w:t>22</w:t>
         </w:r>
         <w:r>
           <w:rPr>
@@ -6542,7 +6542,7 @@
           <w14:ligatures w14:val="standardContextual"/>
         </w:rPr>
       </w:pPr>
-      <w:hyperlink w:anchor="_Toc244368938" w:history="1">
+      <w:hyperlink w:anchor="_Toc244369964" w:history="1">
         <w:r>
           <w:rPr>
             <w:rStyle w:val="Hyperlink"/>
@@ -6569,7 +6569,7 @@
             <w:noProof/>
             <w:webHidden/>
           </w:rPr>
-          <w:instrText xml:space="preserve"> PAGEREF _Toc244368938 \h </w:instrText>
+          <w:instrText xml:space="preserve"> PAGEREF _Toc244369964 \h </w:instrText>
         </w:r>
         <w:r>
           <w:rPr>
@@ -6615,7 +6615,7 @@
           <w14:ligatures w14:val="standardContextual"/>
         </w:rPr>
       </w:pPr>
-      <w:hyperlink w:anchor="_Toc244368939" w:history="1">
+      <w:hyperlink w:anchor="_Toc244369965" w:history="1">
         <w:r>
           <w:rPr>
             <w:rStyle w:val="Hyperlink"/>
@@ -6642,7 +6642,7 @@
             <w:noProof/>
             <w:webHidden/>
           </w:rPr>
-          <w:instrText xml:space="preserve"> PAGEREF _Toc244368939 \h </w:instrText>
+          <w:instrText xml:space="preserve"> PAGEREF _Toc244369965 \h </w:instrText>
         </w:r>
         <w:r>
           <w:rPr>
@@ -6688,7 +6688,7 @@
           <w14:ligatures w14:val="standardContextual"/>
         </w:rPr>
       </w:pPr>
-      <w:hyperlink w:anchor="_Toc244368940" w:history="1">
+      <w:hyperlink w:anchor="_Toc244369966" w:history="1">
         <w:r>
           <w:rPr>
             <w:rStyle w:val="Hyperlink"/>
@@ -6715,7 +6715,7 @@
             <w:noProof/>
             <w:webHidden/>
           </w:rPr>
-          <w:instrText xml:space="preserve"> PAGEREF _Toc244368940 \h </w:instrText>
+          <w:instrText xml:space="preserve"> PAGEREF _Toc244369966 \h </w:instrText>
         </w:r>
         <w:r>
           <w:rPr>
@@ -6761,7 +6761,7 @@
           <w14:ligatures w14:val="standardContextual"/>
         </w:rPr>
       </w:pPr>
-      <w:hyperlink w:anchor="_Toc244368941" w:history="1">
+      <w:hyperlink w:anchor="_Toc244369967" w:history="1">
         <w:r>
           <w:rPr>
             <w:rStyle w:val="Hyperlink"/>
@@ -6788,7 +6788,7 @@
             <w:noProof/>
             <w:webHidden/>
           </w:rPr>
-          <w:instrText xml:space="preserve"> PAGEREF _Toc244368941 \h </w:instrText>
+          <w:instrText xml:space="preserve"> PAGEREF _Toc244369967 \h </w:instrText>
         </w:r>
         <w:r>
           <w:rPr>
@@ -6834,7 +6834,7 @@
           <w14:ligatures w14:val="standardContextual"/>
         </w:rPr>
       </w:pPr>
-      <w:hyperlink w:anchor="_Toc244368942" w:history="1">
+      <w:hyperlink w:anchor="_Toc244369968" w:history="1">
         <w:r>
           <w:rPr>
             <w:rStyle w:val="Hyperlink"/>
@@ -6861,7 +6861,7 @@
             <w:noProof/>
             <w:webHidden/>
           </w:rPr>
-          <w:instrText xml:space="preserve"> PAGEREF _Toc244368942 \h </w:instrText>
+          <w:instrText xml:space="preserve"> PAGEREF _Toc244369968 \h </w:instrText>
         </w:r>
         <w:r>
           <w:rPr>
@@ -6907,7 +6907,7 @@
           <w14:ligatures w14:val="standardContextual"/>
         </w:rPr>
       </w:pPr>
-      <w:hyperlink w:anchor="_Toc244368943" w:history="1">
+      <w:hyperlink w:anchor="_Toc244369969" w:history="1">
         <w:r>
           <w:rPr>
             <w:rStyle w:val="Hyperlink"/>
@@ -6934,7 +6934,7 @@
             <w:noProof/>
             <w:webHidden/>
           </w:rPr>
-          <w:instrText xml:space="preserve"> PAGEREF _Toc244368943 \h </w:instrText>
+          <w:instrText xml:space="preserve"> PAGEREF _Toc244369969 \h </w:instrText>
         </w:r>
         <w:r>
           <w:rPr>
@@ -6980,7 +6980,7 @@
           <w14:ligatures w14:val="standardContextual"/>
         </w:rPr>
       </w:pPr>
-      <w:hyperlink w:anchor="_Toc244368944" w:history="1">
+      <w:hyperlink w:anchor="_Toc244369970" w:history="1">
         <w:r>
           <w:rPr>
             <w:rStyle w:val="Hyperlink"/>
@@ -7007,7 +7007,7 @@
             <w:noProof/>
             <w:webHidden/>
           </w:rPr>
-          <w:instrText xml:space="preserve"> PAGEREF _Toc244368944 \h </w:instrText>
+          <w:instrText xml:space="preserve"> PAGEREF _Toc244369970 \h </w:instrText>
         </w:r>
         <w:r>
           <w:rPr>
@@ -7053,7 +7053,7 @@
           <w14:ligatures w14:val="standardContextual"/>
         </w:rPr>
       </w:pPr>
-      <w:hyperlink w:anchor="_Toc244368945" w:history="1">
+      <w:hyperlink w:anchor="_Toc244369971" w:history="1">
         <w:r>
           <w:rPr>
             <w:rStyle w:val="Hyperlink"/>
@@ -7080,7 +7080,7 @@
             <w:noProof/>
             <w:webHidden/>
           </w:rPr>
-          <w:instrText xml:space="preserve"> PAGEREF _Toc244368945 \h </w:instrText>
+          <w:instrText xml:space="preserve"> PAGEREF _Toc244369971 \h </w:instrText>
         </w:r>
         <w:r>
           <w:rPr>
@@ -7126,7 +7126,7 @@
           <w14:ligatures w14:val="standardContextual"/>
         </w:rPr>
       </w:pPr>
-      <w:hyperlink w:anchor="_Toc244368946" w:history="1">
+      <w:hyperlink w:anchor="_Toc244369972" w:history="1">
         <w:r>
           <w:rPr>
             <w:rStyle w:val="Hyperlink"/>
@@ -7153,7 +7153,7 @@
             <w:noProof/>
             <w:webHidden/>
           </w:rPr>
-          <w:instrText xml:space="preserve"> PAGEREF _Toc244368946 \h </w:instrText>
+          <w:instrText xml:space="preserve"> PAGEREF _Toc244369972 \h </w:instrText>
         </w:r>
         <w:r>
           <w:rPr>
@@ -7199,7 +7199,7 @@
           <w14:ligatures w14:val="standardContextual"/>
         </w:rPr>
       </w:pPr>
-      <w:hyperlink w:anchor="_Toc244368947" w:history="1">
+      <w:hyperlink w:anchor="_Toc244369973" w:history="1">
         <w:r>
           <w:rPr>
             <w:rStyle w:val="Hyperlink"/>
@@ -7226,7 +7226,7 @@
             <w:noProof/>
             <w:webHidden/>
           </w:rPr>
-          <w:instrText xml:space="preserve"> PAGEREF _Toc244368947 \h </w:instrText>
+          <w:instrText xml:space="preserve"> PAGEREF _Toc244369973 \h </w:instrText>
         </w:r>
         <w:r>
           <w:rPr>
@@ -7272,7 +7272,7 @@
           <w14:ligatures w14:val="standardContextual"/>
         </w:rPr>
       </w:pPr>
-      <w:hyperlink w:anchor="_Toc244368948" w:history="1">
+      <w:hyperlink w:anchor="_Toc244369974" w:history="1">
         <w:r>
           <w:rPr>
             <w:rStyle w:val="Hyperlink"/>
@@ -7299,7 +7299,7 @@
             <w:noProof/>
             <w:webHidden/>
           </w:rPr>
-          <w:instrText xml:space="preserve"> PAGEREF _Toc244368948 \h </w:instrText>
+          <w:instrText xml:space="preserve"> PAGEREF _Toc244369974 \h </w:instrText>
         </w:r>
         <w:r>
           <w:rPr>
@@ -7345,7 +7345,7 @@
           <w14:ligatures w14:val="standardContextual"/>
         </w:rPr>
       </w:pPr>
-      <w:hyperlink w:anchor="_Toc244368949" w:history="1">
+      <w:hyperlink w:anchor="_Toc244369975" w:history="1">
         <w:r>
           <w:rPr>
             <w:rStyle w:val="Hyperlink"/>
@@ -7372,7 +7372,7 @@
             <w:noProof/>
             <w:webHidden/>
           </w:rPr>
-          <w:instrText xml:space="preserve"> PAGEREF _Toc244368949 \h </w:instrText>
+          <w:instrText xml:space="preserve"> PAGEREF _Toc244369975 \h </w:instrText>
         </w:r>
         <w:r>
           <w:rPr>
@@ -7418,7 +7418,7 @@
           <w14:ligatures w14:val="standardContextual"/>
         </w:rPr>
       </w:pPr>
-      <w:hyperlink w:anchor="_Toc244368950" w:history="1">
+      <w:hyperlink w:anchor="_Toc244369976" w:history="1">
         <w:r>
           <w:rPr>
             <w:rStyle w:val="Hyperlink"/>
@@ -7445,7 +7445,7 @@
             <w:noProof/>
             <w:webHidden/>
           </w:rPr>
-          <w:instrText xml:space="preserve"> PAGEREF _Toc244368950 \h </w:instrText>
+          <w:instrText xml:space="preserve"> PAGEREF _Toc244369976 \h </w:instrText>
         </w:r>
         <w:r>
           <w:rPr>
@@ -7491,7 +7491,7 @@
           <w14:ligatures w14:val="standardContextual"/>
         </w:rPr>
       </w:pPr>
-      <w:hyperlink w:anchor="_Toc244368951" w:history="1">
+      <w:hyperlink w:anchor="_Toc244369977" w:history="1">
         <w:r>
           <w:rPr>
             <w:rStyle w:val="Hyperlink"/>
@@ -7518,7 +7518,7 @@
             <w:noProof/>
             <w:webHidden/>
           </w:rPr>
-          <w:instrText xml:space="preserve"> PAGEREF _Toc244368951 \h </w:instrText>
+          <w:instrText xml:space="preserve"> PAGEREF _Toc244369977 \h </w:instrText>
         </w:r>
         <w:r>
           <w:rPr>
@@ -7564,7 +7564,7 @@
           <w14:ligatures w14:val="standardContextual"/>
         </w:rPr>
       </w:pPr>
-      <w:hyperlink w:anchor="_Toc244368952" w:history="1">
+      <w:hyperlink w:anchor="_Toc244369978" w:history="1">
         <w:r>
           <w:rPr>
             <w:rStyle w:val="Hyperlink"/>
@@ -7591,7 +7591,7 @@
             <w:noProof/>
             <w:webHidden/>
           </w:rPr>
-          <w:instrText xml:space="preserve"> PAGEREF _Toc244368952 \h </w:instrText>
+          <w:instrText xml:space="preserve"> PAGEREF _Toc244369978 \h </w:instrText>
         </w:r>
         <w:r>
           <w:rPr>
@@ -7637,7 +7637,7 @@
           <w14:ligatures w14:val="standardContextual"/>
         </w:rPr>
       </w:pPr>
-      <w:hyperlink w:anchor="_Toc244368953" w:history="1">
+      <w:hyperlink w:anchor="_Toc244369979" w:history="1">
         <w:r>
           <w:rPr>
             <w:rStyle w:val="Hyperlink"/>
@@ -7664,7 +7664,7 @@
             <w:noProof/>
             <w:webHidden/>
           </w:rPr>
-          <w:instrText xml:space="preserve"> PAGEREF _Toc244368953 \h </w:instrText>
+          <w:instrText xml:space="preserve"> PAGEREF _Toc244369979 \h </w:instrText>
         </w:r>
         <w:r>
           <w:rPr>
@@ -7710,7 +7710,7 @@
           <w14:ligatures w14:val="standardContextual"/>
         </w:rPr>
       </w:pPr>
-      <w:hyperlink w:anchor="_Toc244368954" w:history="1">
+      <w:hyperlink w:anchor="_Toc244369980" w:history="1">
         <w:r>
           <w:rPr>
             <w:rStyle w:val="Hyperlink"/>
@@ -7737,7 +7737,7 @@
             <w:noProof/>
             <w:webHidden/>
           </w:rPr>
-          <w:instrText xml:space="preserve"> PAGEREF _Toc244368954 \h </w:instrText>
+          <w:instrText xml:space="preserve"> PAGEREF _Toc244369980 \h </w:instrText>
         </w:r>
         <w:r>
           <w:rPr>
@@ -7783,7 +7783,7 @@
           <w14:ligatures w14:val="standardContextual"/>
         </w:rPr>
       </w:pPr>
-      <w:hyperlink w:anchor="_Toc244368955" w:history="1">
+      <w:hyperlink w:anchor="_Toc244369981" w:history="1">
         <w:r>
           <w:rPr>
             <w:rStyle w:val="Hyperlink"/>
@@ -7810,7 +7810,7 @@
             <w:noProof/>
             <w:webHidden/>
           </w:rPr>
-          <w:instrText xml:space="preserve"> PAGEREF _Toc244368955 \h </w:instrText>
+          <w:instrText xml:space="preserve"> PAGEREF _Toc244369981 \h </w:instrText>
         </w:r>
         <w:r>
           <w:rPr>
@@ -7856,7 +7856,7 @@
           <w14:ligatures w14:val="standardContextual"/>
         </w:rPr>
       </w:pPr>
-      <w:hyperlink w:anchor="_Toc244368956" w:history="1">
+      <w:hyperlink w:anchor="_Toc244369982" w:history="1">
         <w:r>
           <w:rPr>
             <w:rStyle w:val="Hyperlink"/>
@@ -7883,7 +7883,7 @@
             <w:noProof/>
             <w:webHidden/>
           </w:rPr>
-          <w:instrText xml:space="preserve"> PAGEREF _Toc244368956 \h </w:instrText>
+          <w:instrText xml:space="preserve"> PAGEREF _Toc244369982 \h </w:instrText>
         </w:r>
         <w:r>
           <w:rPr>
@@ -7929,7 +7929,7 @@
           <w14:ligatures w14:val="standardContextual"/>
         </w:rPr>
       </w:pPr>
-      <w:hyperlink w:anchor="_Toc244368957" w:history="1">
+      <w:hyperlink w:anchor="_Toc244369983" w:history="1">
         <w:r>
           <w:rPr>
             <w:rStyle w:val="Hyperlink"/>
@@ -7956,7 +7956,7 @@
             <w:noProof/>
             <w:webHidden/>
           </w:rPr>
-          <w:instrText xml:space="preserve"> PAGEREF _Toc244368957 \h </w:instrText>
+          <w:instrText xml:space="preserve"> PAGEREF _Toc244369983 \h </w:instrText>
         </w:r>
         <w:r>
           <w:rPr>
@@ -8002,7 +8002,7 @@
           <w14:ligatures w14:val="standardContextual"/>
         </w:rPr>
       </w:pPr>
-      <w:hyperlink w:anchor="_Toc244368958" w:history="1">
+      <w:hyperlink w:anchor="_Toc244369984" w:history="1">
         <w:r>
           <w:rPr>
             <w:rStyle w:val="Hyperlink"/>
@@ -8029,7 +8029,7 @@
             <w:noProof/>
             <w:webHidden/>
           </w:rPr>
-          <w:instrText xml:space="preserve"> PAGEREF _Toc244368958 \h </w:instrText>
+          <w:instrText xml:space="preserve"> PAGEREF _Toc244369984 \h </w:instrText>
         </w:r>
         <w:r>
           <w:rPr>
@@ -8075,7 +8075,7 @@
           <w14:ligatures w14:val="standardContextual"/>
         </w:rPr>
       </w:pPr>
-      <w:hyperlink w:anchor="_Toc244368959" w:history="1">
+      <w:hyperlink w:anchor="_Toc244369985" w:history="1">
         <w:r>
           <w:rPr>
             <w:rStyle w:val="Hyperlink"/>
@@ -8102,7 +8102,7 @@
             <w:noProof/>
             <w:webHidden/>
           </w:rPr>
-          <w:instrText xml:space="preserve"> PAGEREF _Toc244368959 \h </w:instrText>
+          <w:instrText xml:space="preserve"> PAGEREF _Toc244369985 \h </w:instrText>
         </w:r>
         <w:r>
           <w:rPr>
@@ -8148,7 +8148,7 @@
           <w14:ligatures w14:val="standardContextual"/>
         </w:rPr>
       </w:pPr>
-      <w:hyperlink w:anchor="_Toc244368960" w:history="1">
+      <w:hyperlink w:anchor="_Toc244369986" w:history="1">
         <w:r>
           <w:rPr>
             <w:rStyle w:val="Hyperlink"/>
@@ -8175,7 +8175,7 @@
             <w:noProof/>
             <w:webHidden/>
           </w:rPr>
-          <w:instrText xml:space="preserve"> PAGEREF _Toc244368960 \h </w:instrText>
+          <w:instrText xml:space="preserve"> PAGEREF _Toc244369986 \h </w:instrText>
         </w:r>
         <w:r>
           <w:rPr>
@@ -8221,7 +8221,7 @@
           <w14:ligatures w14:val="standardContextual"/>
         </w:rPr>
       </w:pPr>
-      <w:hyperlink w:anchor="_Toc244368961" w:history="1">
+      <w:hyperlink w:anchor="_Toc244369987" w:history="1">
         <w:r>
           <w:rPr>
             <w:rStyle w:val="Hyperlink"/>
@@ -8248,7 +8248,7 @@
             <w:noProof/>
             <w:webHidden/>
           </w:rPr>
-          <w:instrText xml:space="preserve"> PAGEREF _Toc244368961 \h </w:instrText>
+          <w:instrText xml:space="preserve"> PAGEREF _Toc244369987 \h </w:instrText>
         </w:r>
         <w:r>
           <w:rPr>
@@ -8294,7 +8294,7 @@
           <w14:ligatures w14:val="standardContextual"/>
         </w:rPr>
       </w:pPr>
-      <w:hyperlink w:anchor="_Toc244368962" w:history="1">
+      <w:hyperlink w:anchor="_Toc244369988" w:history="1">
         <w:r>
           <w:rPr>
             <w:rStyle w:val="Hyperlink"/>
@@ -8321,7 +8321,7 @@
             <w:noProof/>
             <w:webHidden/>
           </w:rPr>
-          <w:instrText xml:space="preserve"> PAGEREF _Toc244368962 \h </w:instrText>
+          <w:instrText xml:space="preserve"> PAGEREF _Toc244369988 \h </w:instrText>
         </w:r>
         <w:r>
           <w:rPr>
@@ -8367,7 +8367,7 @@
           <w14:ligatures w14:val="standardContextual"/>
         </w:rPr>
       </w:pPr>
-      <w:hyperlink w:anchor="_Toc244368963" w:history="1">
+      <w:hyperlink w:anchor="_Toc244369989" w:history="1">
         <w:r>
           <w:rPr>
             <w:rStyle w:val="Hyperlink"/>
@@ -8394,7 +8394,7 @@
             <w:noProof/>
             <w:webHidden/>
           </w:rPr>
-          <w:instrText xml:space="preserve"> PAGEREF _Toc244368963 \h </w:instrText>
+          <w:instrText xml:space="preserve"> PAGEREF _Toc244369989 \h </w:instrText>
         </w:r>
         <w:r>
           <w:rPr>
@@ -8440,7 +8440,7 @@
           <w14:ligatures w14:val="standardContextual"/>
         </w:rPr>
       </w:pPr>
-      <w:hyperlink w:anchor="_Toc244368964" w:history="1">
+      <w:hyperlink w:anchor="_Toc244369990" w:history="1">
         <w:r>
           <w:rPr>
             <w:rStyle w:val="Hyperlink"/>
@@ -8467,7 +8467,7 @@
             <w:noProof/>
             <w:webHidden/>
           </w:rPr>
-          <w:instrText xml:space="preserve"> PAGEREF _Toc244368964 \h </w:instrText>
+          <w:instrText xml:space="preserve"> PAGEREF _Toc244369990 \h </w:instrText>
         </w:r>
         <w:r>
           <w:rPr>
@@ -8513,7 +8513,7 @@
           <w14:ligatures w14:val="standardContextual"/>
         </w:rPr>
       </w:pPr>
-      <w:hyperlink w:anchor="_Toc244368965" w:history="1">
+      <w:hyperlink w:anchor="_Toc244369991" w:history="1">
         <w:r>
           <w:rPr>
             <w:rStyle w:val="Hyperlink"/>
@@ -8540,7 +8540,7 @@
             <w:noProof/>
             <w:webHidden/>
           </w:rPr>
-          <w:instrText xml:space="preserve"> PAGEREF _Toc244368965 \h </w:instrText>
+          <w:instrText xml:space="preserve"> PAGEREF _Toc244369991 \h </w:instrText>
         </w:r>
         <w:r>
           <w:rPr>
@@ -8586,7 +8586,7 @@
           <w14:ligatures w14:val="standardContextual"/>
         </w:rPr>
       </w:pPr>
-      <w:hyperlink w:anchor="_Toc244368966" w:history="1">
+      <w:hyperlink w:anchor="_Toc244369992" w:history="1">
         <w:r>
           <w:rPr>
             <w:rStyle w:val="Hyperlink"/>
@@ -8613,7 +8613,7 @@
             <w:noProof/>
             <w:webHidden/>
           </w:rPr>
-          <w:instrText xml:space="preserve"> PAGEREF _Toc244368966 \h </w:instrText>
+          <w:instrText xml:space="preserve"> PAGEREF _Toc244369992 \h </w:instrText>
         </w:r>
         <w:r>
           <w:rPr>
@@ -8659,7 +8659,7 @@
           <w14:ligatures w14:val="standardContextual"/>
         </w:rPr>
       </w:pPr>
-      <w:hyperlink w:anchor="_Toc244368967" w:history="1">
+      <w:hyperlink w:anchor="_Toc244369993" w:history="1">
         <w:r>
           <w:rPr>
             <w:rStyle w:val="Hyperlink"/>
@@ -8686,7 +8686,7 @@
             <w:noProof/>
             <w:webHidden/>
           </w:rPr>
-          <w:instrText xml:space="preserve"> PAGEREF _Toc244368967 \h </w:instrText>
+          <w:instrText xml:space="preserve"> PAGEREF _Toc244369993 \h </w:instrText>
         </w:r>
         <w:r>
           <w:rPr>
@@ -8732,7 +8732,7 @@
           <w14:ligatures w14:val="standardContextual"/>
         </w:rPr>
       </w:pPr>
-      <w:hyperlink w:anchor="_Toc244368968" w:history="1">
+      <w:hyperlink w:anchor="_Toc244369994" w:history="1">
         <w:r>
           <w:rPr>
             <w:rStyle w:val="Hyperlink"/>
@@ -8759,7 +8759,7 @@
             <w:noProof/>
             <w:webHidden/>
           </w:rPr>
-          <w:instrText xml:space="preserve"> PAGEREF _Toc244368968 \h </w:instrText>
+          <w:instrText xml:space="preserve"> PAGEREF _Toc244369994 \h </w:instrText>
         </w:r>
         <w:r>
           <w:rPr>
@@ -8805,7 +8805,7 @@
           <w14:ligatures w14:val="standardContextual"/>
         </w:rPr>
       </w:pPr>
-      <w:hyperlink w:anchor="_Toc244368969" w:history="1">
+      <w:hyperlink w:anchor="_Toc244369995" w:history="1">
         <w:r>
           <w:rPr>
             <w:rStyle w:val="Hyperlink"/>
@@ -8832,7 +8832,7 @@
             <w:noProof/>
             <w:webHidden/>
           </w:rPr>
-          <w:instrText xml:space="preserve"> PAGEREF _Toc244368969 \h </w:instrText>
+          <w:instrText xml:space="preserve"> PAGEREF _Toc244369995 \h </w:instrText>
         </w:r>
         <w:r>
           <w:rPr>
@@ -8878,7 +8878,7 @@
           <w14:ligatures w14:val="standardContextual"/>
         </w:rPr>
       </w:pPr>
-      <w:hyperlink w:anchor="_Toc244368970" w:history="1">
+      <w:hyperlink w:anchor="_Toc244369996" w:history="1">
         <w:r>
           <w:rPr>
             <w:rStyle w:val="Hyperlink"/>
@@ -8905,7 +8905,7 @@
             <w:noProof/>
             <w:webHidden/>
           </w:rPr>
-          <w:instrText xml:space="preserve"> PAGEREF _Toc244368970 \h </w:instrText>
+          <w:instrText xml:space="preserve"> PAGEREF _Toc244369996 \h </w:instrText>
         </w:r>
         <w:r>
           <w:rPr>
@@ -8951,7 +8951,7 @@
           <w14:ligatures w14:val="standardContextual"/>
         </w:rPr>
       </w:pPr>
-      <w:hyperlink w:anchor="_Toc244368971" w:history="1">
+      <w:hyperlink w:anchor="_Toc244369997" w:history="1">
         <w:r>
           <w:rPr>
             <w:rStyle w:val="Hyperlink"/>
@@ -8978,7 +8978,7 @@
             <w:noProof/>
             <w:webHidden/>
           </w:rPr>
-          <w:instrText xml:space="preserve"> PAGEREF _Toc244368971 \h </w:instrText>
+          <w:instrText xml:space="preserve"> PAGEREF _Toc244369997 \h </w:instrText>
         </w:r>
         <w:r>
           <w:rPr>
@@ -9024,7 +9024,7 @@
           <w14:ligatures w14:val="standardContextual"/>
         </w:rPr>
       </w:pPr>
-      <w:hyperlink w:anchor="_Toc244368972" w:history="1">
+      <w:hyperlink w:anchor="_Toc244369998" w:history="1">
         <w:r>
           <w:rPr>
             <w:rStyle w:val="Hyperlink"/>
@@ -9051,7 +9051,7 @@
             <w:noProof/>
             <w:webHidden/>
           </w:rPr>
-          <w:instrText xml:space="preserve"> PAGEREF _Toc244368972 \h </w:instrText>
+          <w:instrText xml:space="preserve"> PAGEREF _Toc244369998 \h </w:instrText>
         </w:r>
         <w:r>
           <w:rPr>
@@ -9097,7 +9097,7 @@
           <w14:ligatures w14:val="standardContextual"/>
         </w:rPr>
       </w:pPr>
-      <w:hyperlink w:anchor="_Toc244368973" w:history="1">
+      <w:hyperlink w:anchor="_Toc244369999" w:history="1">
         <w:r>
           <w:rPr>
             <w:rStyle w:val="Hyperlink"/>
@@ -9124,7 +9124,7 @@
             <w:noProof/>
             <w:webHidden/>
           </w:rPr>
-          <w:instrText xml:space="preserve"> PAGEREF _Toc244368973 \h </w:instrText>
+          <w:instrText xml:space="preserve"> PAGEREF _Toc244369999 \h </w:instrText>
         </w:r>
         <w:r>
           <w:rPr>
@@ -9170,7 +9170,7 @@
           <w14:ligatures w14:val="standardContextual"/>
         </w:rPr>
       </w:pPr>
-      <w:hyperlink w:anchor="_Toc244368974" w:history="1">
+      <w:hyperlink w:anchor="_Toc244370000" w:history="1">
         <w:r>
           <w:rPr>
             <w:rStyle w:val="Hyperlink"/>
@@ -9197,7 +9197,7 @@
             <w:noProof/>
             <w:webHidden/>
           </w:rPr>
-          <w:instrText xml:space="preserve"> PAGEREF _Toc244368974 \h </w:instrText>
+          <w:instrText xml:space="preserve"> PAGEREF _Toc244370000 \h </w:instrText>
         </w:r>
         <w:r>
           <w:rPr>
@@ -9243,7 +9243,7 @@
           <w14:ligatures w14:val="standardContextual"/>
         </w:rPr>
       </w:pPr>
-      <w:hyperlink w:anchor="_Toc244368975" w:history="1">
+      <w:hyperlink w:anchor="_Toc244370001" w:history="1">
         <w:r>
           <w:rPr>
             <w:rStyle w:val="Hyperlink"/>
@@ -9270,7 +9270,7 @@
             <w:noProof/>
             <w:webHidden/>
           </w:rPr>
-          <w:instrText xml:space="preserve"> PAGEREF _Toc244368975 \h </w:instrText>
+          <w:instrText xml:space="preserve"> PAGEREF _Toc244370001 \h </w:instrText>
         </w:r>
         <w:r>
           <w:rPr>
@@ -9316,7 +9316,7 @@
           <w14:ligatures w14:val="standardContextual"/>
         </w:rPr>
       </w:pPr>
-      <w:hyperlink w:anchor="_Toc244368976" w:history="1">
+      <w:hyperlink w:anchor="_Toc244370002" w:history="1">
         <w:r>
           <w:rPr>
             <w:rStyle w:val="Hyperlink"/>
@@ -9343,7 +9343,7 @@
             <w:noProof/>
             <w:webHidden/>
           </w:rPr>
-          <w:instrText xml:space="preserve"> PAGEREF _Toc244368976 \h </w:instrText>
+          <w:instrText xml:space="preserve"> PAGEREF _Toc244370002 \h </w:instrText>
         </w:r>
         <w:r>
           <w:rPr>
@@ -9393,7 +9393,7 @@
       <w:pPr>
         <w:pStyle w:val="RListTitle"/>
       </w:pPr>
-      <w:bookmarkStart w:id="11" w:name="_Toc244368883"/>
+      <w:bookmarkStart w:id="11" w:name="_Toc244369909"/>
       <w:r>
         <w:t>LIST OF FIGURES</w:t>
       </w:r>
@@ -9423,7 +9423,7 @@
       <w:r>
         <w:fldChar w:fldCharType="separate"/>
       </w:r>
-      <w:hyperlink w:anchor="_Toc244368977" w:history="1">
+      <w:hyperlink w:anchor="_Toc244370003" w:history="1">
         <w:r>
           <w:rPr>
             <w:rStyle w:val="Hyperlink"/>
@@ -9458,7 +9458,7 @@
             <w:noProof/>
             <w:webHidden/>
           </w:rPr>
-          <w:instrText xml:space="preserve"> PAGEREF _Toc244368977 \h </w:instrText>
+          <w:instrText xml:space="preserve"> PAGEREF _Toc244370003 \h </w:instrText>
         </w:r>
         <w:r>
           <w:rPr>
@@ -9504,7 +9504,7 @@
           <w14:ligatures w14:val="standardContextual"/>
         </w:rPr>
       </w:pPr>
-      <w:hyperlink w:anchor="_Toc244368978" w:history="1">
+      <w:hyperlink w:anchor="_Toc244370004" w:history="1">
         <w:r>
           <w:rPr>
             <w:rStyle w:val="Hyperlink"/>
@@ -9539,7 +9539,7 @@
             <w:noProof/>
             <w:webHidden/>
           </w:rPr>
-          <w:instrText xml:space="preserve"> PAGEREF _Toc244368978 \h </w:instrText>
+          <w:instrText xml:space="preserve"> PAGEREF _Toc244370004 \h </w:instrText>
         </w:r>
         <w:r>
           <w:rPr>
@@ -9585,7 +9585,7 @@
           <w14:ligatures w14:val="standardContextual"/>
         </w:rPr>
       </w:pPr>
-      <w:hyperlink w:anchor="_Toc244368979" w:history="1">
+      <w:hyperlink w:anchor="_Toc244370005" w:history="1">
         <w:r>
           <w:rPr>
             <w:rStyle w:val="Hyperlink"/>
@@ -9620,7 +9620,7 @@
             <w:noProof/>
             <w:webHidden/>
           </w:rPr>
-          <w:instrText xml:space="preserve"> PAGEREF _Toc244368979 \h </w:instrText>
+          <w:instrText xml:space="preserve"> PAGEREF _Toc244370005 \h </w:instrText>
         </w:r>
         <w:r>
           <w:rPr>
@@ -9666,7 +9666,7 @@
           <w14:ligatures w14:val="standardContextual"/>
         </w:rPr>
       </w:pPr>
-      <w:hyperlink w:anchor="_Toc244368980" w:history="1">
+      <w:hyperlink w:anchor="_Toc244370006" w:history="1">
         <w:r>
           <w:rPr>
             <w:rStyle w:val="Hyperlink"/>
@@ -9701,7 +9701,7 @@
             <w:noProof/>
             <w:webHidden/>
           </w:rPr>
-          <w:instrText xml:space="preserve"> PAGEREF _Toc244368980 \h </w:instrText>
+          <w:instrText xml:space="preserve"> PAGEREF _Toc244370006 \h </w:instrText>
         </w:r>
         <w:r>
           <w:rPr>
@@ -9747,7 +9747,7 @@
           <w14:ligatures w14:val="standardContextual"/>
         </w:rPr>
       </w:pPr>
-      <w:hyperlink w:anchor="_Toc244368981" w:history="1">
+      <w:hyperlink w:anchor="_Toc244370007" w:history="1">
         <w:r>
           <w:rPr>
             <w:rStyle w:val="Hyperlink"/>
@@ -9782,7 +9782,7 @@
             <w:noProof/>
             <w:webHidden/>
           </w:rPr>
-          <w:instrText xml:space="preserve"> PAGEREF _Toc244368981 \h </w:instrText>
+          <w:instrText xml:space="preserve"> PAGEREF _Toc244370007 \h </w:instrText>
         </w:r>
         <w:r>
           <w:rPr>
@@ -9828,7 +9828,7 @@
           <w14:ligatures w14:val="standardContextual"/>
         </w:rPr>
       </w:pPr>
-      <w:hyperlink w:anchor="_Toc244368982" w:history="1">
+      <w:hyperlink w:anchor="_Toc244370008" w:history="1">
         <w:r>
           <w:rPr>
             <w:rStyle w:val="Hyperlink"/>
@@ -9863,7 +9863,7 @@
             <w:noProof/>
             <w:webHidden/>
           </w:rPr>
-          <w:instrText xml:space="preserve"> PAGEREF _Toc244368982 \h </w:instrText>
+          <w:instrText xml:space="preserve"> PAGEREF _Toc244370008 \h </w:instrText>
         </w:r>
         <w:r>
           <w:rPr>
@@ -9909,7 +9909,7 @@
           <w14:ligatures w14:val="standardContextual"/>
         </w:rPr>
       </w:pPr>
-      <w:hyperlink w:anchor="_Toc244368983" w:history="1">
+      <w:hyperlink w:anchor="_Toc244370009" w:history="1">
         <w:r>
           <w:rPr>
             <w:rStyle w:val="Hyperlink"/>
@@ -9944,7 +9944,7 @@
             <w:noProof/>
             <w:webHidden/>
           </w:rPr>
-          <w:instrText xml:space="preserve"> PAGEREF _Toc244368983 \h </w:instrText>
+          <w:instrText xml:space="preserve"> PAGEREF _Toc244370009 \h </w:instrText>
         </w:r>
         <w:r>
           <w:rPr>
@@ -9990,7 +9990,7 @@
           <w14:ligatures w14:val="standardContextual"/>
         </w:rPr>
       </w:pPr>
-      <w:hyperlink w:anchor="_Toc244368984" w:history="1">
+      <w:hyperlink w:anchor="_Toc244370010" w:history="1">
         <w:r>
           <w:rPr>
             <w:rStyle w:val="Hyperlink"/>
@@ -10025,7 +10025,7 @@
             <w:noProof/>
             <w:webHidden/>
           </w:rPr>
-          <w:instrText xml:space="preserve"> PAGEREF _Toc244368984 \h </w:instrText>
+          <w:instrText xml:space="preserve"> PAGEREF _Toc244370010 \h </w:instrText>
         </w:r>
         <w:r>
           <w:rPr>
@@ -10071,7 +10071,7 @@
           <w14:ligatures w14:val="standardContextual"/>
         </w:rPr>
       </w:pPr>
-      <w:hyperlink w:anchor="_Toc244368985" w:history="1">
+      <w:hyperlink w:anchor="_Toc244370011" w:history="1">
         <w:r>
           <w:rPr>
             <w:rStyle w:val="Hyperlink"/>
@@ -10106,7 +10106,7 @@
             <w:noProof/>
             <w:webHidden/>
           </w:rPr>
-          <w:instrText xml:space="preserve"> PAGEREF _Toc244368985 \h </w:instrText>
+          <w:instrText xml:space="preserve"> PAGEREF _Toc244370011 \h </w:instrText>
         </w:r>
         <w:r>
           <w:rPr>
@@ -10152,7 +10152,7 @@
           <w14:ligatures w14:val="standardContextual"/>
         </w:rPr>
       </w:pPr>
-      <w:hyperlink w:anchor="_Toc244368986" w:history="1">
+      <w:hyperlink w:anchor="_Toc244370012" w:history="1">
         <w:r>
           <w:rPr>
             <w:rStyle w:val="Hyperlink"/>
@@ -10187,7 +10187,7 @@
             <w:noProof/>
             <w:webHidden/>
           </w:rPr>
-          <w:instrText xml:space="preserve"> PAGEREF _Toc244368986 \h </w:instrText>
+          <w:instrText xml:space="preserve"> PAGEREF _Toc244370012 \h </w:instrText>
         </w:r>
         <w:r>
           <w:rPr>
@@ -10233,7 +10233,7 @@
           <w14:ligatures w14:val="standardContextual"/>
         </w:rPr>
       </w:pPr>
-      <w:hyperlink w:anchor="_Toc244368987" w:history="1">
+      <w:hyperlink w:anchor="_Toc244370013" w:history="1">
         <w:r>
           <w:rPr>
             <w:rStyle w:val="Hyperlink"/>
@@ -10268,7 +10268,7 @@
             <w:noProof/>
             <w:webHidden/>
           </w:rPr>
-          <w:instrText xml:space="preserve"> PAGEREF _Toc244368987 \h </w:instrText>
+          <w:instrText xml:space="preserve"> PAGEREF _Toc244370013 \h </w:instrText>
         </w:r>
         <w:r>
           <w:rPr>
@@ -10314,7 +10314,7 @@
           <w14:ligatures w14:val="standardContextual"/>
         </w:rPr>
       </w:pPr>
-      <w:hyperlink w:anchor="_Toc244368988" w:history="1">
+      <w:hyperlink w:anchor="_Toc244370014" w:history="1">
         <w:r>
           <w:rPr>
             <w:rStyle w:val="Hyperlink"/>
@@ -10349,7 +10349,7 @@
             <w:noProof/>
             <w:webHidden/>
           </w:rPr>
-          <w:instrText xml:space="preserve"> PAGEREF _Toc244368988 \h </w:instrText>
+          <w:instrText xml:space="preserve"> PAGEREF _Toc244370014 \h </w:instrText>
         </w:r>
         <w:r>
           <w:rPr>
@@ -10395,7 +10395,7 @@
           <w14:ligatures w14:val="standardContextual"/>
         </w:rPr>
       </w:pPr>
-      <w:hyperlink w:anchor="_Toc244368989" w:history="1">
+      <w:hyperlink w:anchor="_Toc244370015" w:history="1">
         <w:r>
           <w:rPr>
             <w:rStyle w:val="Hyperlink"/>
@@ -10430,7 +10430,7 @@
             <w:noProof/>
             <w:webHidden/>
           </w:rPr>
-          <w:instrText xml:space="preserve"> PAGEREF _Toc244368989 \h </w:instrText>
+          <w:instrText xml:space="preserve"> PAGEREF _Toc244370015 \h </w:instrText>
         </w:r>
         <w:r>
           <w:rPr>
@@ -10476,7 +10476,7 @@
           <w14:ligatures w14:val="standardContextual"/>
         </w:rPr>
       </w:pPr>
-      <w:hyperlink w:anchor="_Toc244368990" w:history="1">
+      <w:hyperlink w:anchor="_Toc244370016" w:history="1">
         <w:r>
           <w:rPr>
             <w:rStyle w:val="Hyperlink"/>
@@ -10511,7 +10511,7 @@
             <w:noProof/>
             <w:webHidden/>
           </w:rPr>
-          <w:instrText xml:space="preserve"> PAGEREF _Toc244368990 \h </w:instrText>
+          <w:instrText xml:space="preserve"> PAGEREF _Toc244370016 \h </w:instrText>
         </w:r>
         <w:r>
           <w:rPr>
@@ -10557,7 +10557,7 @@
           <w14:ligatures w14:val="standardContextual"/>
         </w:rPr>
       </w:pPr>
-      <w:hyperlink w:anchor="_Toc244368991" w:history="1">
+      <w:hyperlink w:anchor="_Toc244370017" w:history="1">
         <w:r>
           <w:rPr>
             <w:rStyle w:val="Hyperlink"/>
@@ -10592,7 +10592,7 @@
             <w:noProof/>
             <w:webHidden/>
           </w:rPr>
-          <w:instrText xml:space="preserve"> PAGEREF _Toc244368991 \h </w:instrText>
+          <w:instrText xml:space="preserve"> PAGEREF _Toc244370017 \h </w:instrText>
         </w:r>
         <w:r>
           <w:rPr>
@@ -10638,7 +10638,7 @@
           <w14:ligatures w14:val="standardContextual"/>
         </w:rPr>
       </w:pPr>
-      <w:hyperlink w:anchor="_Toc244368992" w:history="1">
+      <w:hyperlink w:anchor="_Toc244370018" w:history="1">
         <w:r>
           <w:rPr>
             <w:rStyle w:val="Hyperlink"/>
@@ -10673,7 +10673,7 @@
             <w:noProof/>
             <w:webHidden/>
           </w:rPr>
-          <w:instrText xml:space="preserve"> PAGEREF _Toc244368992 \h </w:instrText>
+          <w:instrText xml:space="preserve"> PAGEREF _Toc244370018 \h </w:instrText>
         </w:r>
         <w:r>
           <w:rPr>
@@ -10719,7 +10719,7 @@
           <w14:ligatures w14:val="standardContextual"/>
         </w:rPr>
       </w:pPr>
-      <w:hyperlink w:anchor="_Toc244368993" w:history="1">
+      <w:hyperlink w:anchor="_Toc244370019" w:history="1">
         <w:r>
           <w:rPr>
             <w:rStyle w:val="Hyperlink"/>
@@ -10754,7 +10754,7 @@
             <w:noProof/>
             <w:webHidden/>
           </w:rPr>
-          <w:instrText xml:space="preserve"> PAGEREF _Toc244368993 \h </w:instrText>
+          <w:instrText xml:space="preserve"> PAGEREF _Toc244370019 \h </w:instrText>
         </w:r>
         <w:r>
           <w:rPr>
@@ -10800,7 +10800,7 @@
           <w14:ligatures w14:val="standardContextual"/>
         </w:rPr>
       </w:pPr>
-      <w:hyperlink w:anchor="_Toc244368994" w:history="1">
+      <w:hyperlink w:anchor="_Toc244370020" w:history="1">
         <w:r>
           <w:rPr>
             <w:rStyle w:val="Hyperlink"/>
@@ -10835,7 +10835,7 @@
             <w:noProof/>
             <w:webHidden/>
           </w:rPr>
-          <w:instrText xml:space="preserve"> PAGEREF _Toc244368994 \h </w:instrText>
+          <w:instrText xml:space="preserve"> PAGEREF _Toc244370020 \h </w:instrText>
         </w:r>
         <w:r>
           <w:rPr>
@@ -10881,7 +10881,7 @@
           <w14:ligatures w14:val="standardContextual"/>
         </w:rPr>
       </w:pPr>
-      <w:hyperlink w:anchor="_Toc244368995" w:history="1">
+      <w:hyperlink w:anchor="_Toc244370021" w:history="1">
         <w:r>
           <w:rPr>
             <w:rStyle w:val="Hyperlink"/>
@@ -10916,7 +10916,7 @@
             <w:noProof/>
             <w:webHidden/>
           </w:rPr>
-          <w:instrText xml:space="preserve"> PAGEREF _Toc244368995 \h </w:instrText>
+          <w:instrText xml:space="preserve"> PAGEREF _Toc244370021 \h </w:instrText>
         </w:r>
         <w:r>
           <w:rPr>
@@ -10962,7 +10962,7 @@
           <w14:ligatures w14:val="standardContextual"/>
         </w:rPr>
       </w:pPr>
-      <w:hyperlink w:anchor="_Toc244368996" w:history="1">
+      <w:hyperlink w:anchor="_Toc244370022" w:history="1">
         <w:r>
           <w:rPr>
             <w:rStyle w:val="Hyperlink"/>
@@ -10997,7 +10997,7 @@
             <w:noProof/>
             <w:webHidden/>
           </w:rPr>
-          <w:instrText xml:space="preserve"> PAGEREF _Toc244368996 \h </w:instrText>
+          <w:instrText xml:space="preserve"> PAGEREF _Toc244370022 \h </w:instrText>
         </w:r>
         <w:r>
           <w:rPr>
@@ -11047,7 +11047,7 @@
       <w:pPr>
         <w:pStyle w:val="RListTitle"/>
       </w:pPr>
-      <w:bookmarkStart w:id="12" w:name="_Toc244368884"/>
+      <w:bookmarkStart w:id="12" w:name="_Toc244369910"/>
       <w:r>
         <w:t>LIST OF TABLES</w:t>
       </w:r>
@@ -11077,7 +11077,7 @@
       <w:r>
         <w:fldChar w:fldCharType="separate"/>
       </w:r>
-      <w:hyperlink w:anchor="_Toc244368997" w:history="1">
+      <w:hyperlink w:anchor="_Toc244370023" w:history="1">
         <w:r>
           <w:rPr>
             <w:rStyle w:val="Hyperlink"/>
@@ -11112,7 +11112,7 @@
             <w:noProof/>
             <w:webHidden/>
           </w:rPr>
-          <w:instrText xml:space="preserve"> PAGEREF _Toc244368997 \h </w:instrText>
+          <w:instrText xml:space="preserve"> PAGEREF _Toc244370023 \h </w:instrText>
         </w:r>
         <w:r>
           <w:rPr>
@@ -11158,7 +11158,7 @@
           <w14:ligatures w14:val="standardContextual"/>
         </w:rPr>
       </w:pPr>
-      <w:hyperlink w:anchor="_Toc244368998" w:history="1">
+      <w:hyperlink w:anchor="_Toc244370024" w:history="1">
         <w:r>
           <w:rPr>
             <w:rStyle w:val="Hyperlink"/>
@@ -11193,7 +11193,7 @@
             <w:noProof/>
             <w:webHidden/>
           </w:rPr>
-          <w:instrText xml:space="preserve"> PAGEREF _Toc244368998 \h </w:instrText>
+          <w:instrText xml:space="preserve"> PAGEREF _Toc244370024 \h </w:instrText>
         </w:r>
         <w:r>
           <w:rPr>
@@ -11239,7 +11239,7 @@
           <w14:ligatures w14:val="standardContextual"/>
         </w:rPr>
       </w:pPr>
-      <w:hyperlink w:anchor="_Toc244368999" w:history="1">
+      <w:hyperlink w:anchor="_Toc244370025" w:history="1">
         <w:r>
           <w:rPr>
             <w:rStyle w:val="Hyperlink"/>
@@ -11274,7 +11274,7 @@
             <w:noProof/>
             <w:webHidden/>
           </w:rPr>
-          <w:instrText xml:space="preserve"> PAGEREF _Toc244368999 \h </w:instrText>
+          <w:instrText xml:space="preserve"> PAGEREF _Toc244370025 \h </w:instrText>
         </w:r>
         <w:r>
           <w:rPr>
@@ -11320,7 +11320,7 @@
           <w14:ligatures w14:val="standardContextual"/>
         </w:rPr>
       </w:pPr>
-      <w:hyperlink w:anchor="_Toc244369000" w:history="1">
+      <w:hyperlink w:anchor="_Toc244370026" w:history="1">
         <w:r>
           <w:rPr>
             <w:rStyle w:val="Hyperlink"/>
@@ -11355,7 +11355,7 @@
             <w:noProof/>
             <w:webHidden/>
           </w:rPr>
-          <w:instrText xml:space="preserve"> PAGEREF _Toc244369000 \h </w:instrText>
+          <w:instrText xml:space="preserve"> PAGEREF _Toc244370026 \h </w:instrText>
         </w:r>
         <w:r>
           <w:rPr>
@@ -11401,7 +11401,7 @@
           <w14:ligatures w14:val="standardContextual"/>
         </w:rPr>
       </w:pPr>
-      <w:hyperlink w:anchor="_Toc244369001" w:history="1">
+      <w:hyperlink w:anchor="_Toc244370027" w:history="1">
         <w:r>
           <w:rPr>
             <w:rStyle w:val="Hyperlink"/>
@@ -11436,7 +11436,7 @@
             <w:noProof/>
             <w:webHidden/>
           </w:rPr>
-          <w:instrText xml:space="preserve"> PAGEREF _Toc244369001 \h </w:instrText>
+          <w:instrText xml:space="preserve"> PAGEREF _Toc244370027 \h </w:instrText>
         </w:r>
         <w:r>
           <w:rPr>
@@ -11482,7 +11482,7 @@
           <w14:ligatures w14:val="standardContextual"/>
         </w:rPr>
       </w:pPr>
-      <w:hyperlink w:anchor="_Toc244369002" w:history="1">
+      <w:hyperlink w:anchor="_Toc244370028" w:history="1">
         <w:r>
           <w:rPr>
             <w:rStyle w:val="Hyperlink"/>
@@ -11517,7 +11517,7 @@
             <w:noProof/>
             <w:webHidden/>
           </w:rPr>
-          <w:instrText xml:space="preserve"> PAGEREF _Toc244369002 \h </w:instrText>
+          <w:instrText xml:space="preserve"> PAGEREF _Toc244370028 \h </w:instrText>
         </w:r>
         <w:r>
           <w:rPr>
@@ -11563,7 +11563,7 @@
           <w14:ligatures w14:val="standardContextual"/>
         </w:rPr>
       </w:pPr>
-      <w:hyperlink w:anchor="_Toc244369003" w:history="1">
+      <w:hyperlink w:anchor="_Toc244370029" w:history="1">
         <w:r>
           <w:rPr>
             <w:rStyle w:val="Hyperlink"/>
@@ -11598,7 +11598,7 @@
             <w:noProof/>
             <w:webHidden/>
           </w:rPr>
-          <w:instrText xml:space="preserve"> PAGEREF _Toc244369003 \h </w:instrText>
+          <w:instrText xml:space="preserve"> PAGEREF _Toc244370029 \h </w:instrText>
         </w:r>
         <w:r>
           <w:rPr>
@@ -11644,7 +11644,7 @@
           <w14:ligatures w14:val="standardContextual"/>
         </w:rPr>
       </w:pPr>
-      <w:hyperlink w:anchor="_Toc244369004" w:history="1">
+      <w:hyperlink w:anchor="_Toc244370030" w:history="1">
         <w:r>
           <w:rPr>
             <w:rStyle w:val="Hyperlink"/>
@@ -11679,7 +11679,7 @@
             <w:noProof/>
             <w:webHidden/>
           </w:rPr>
-          <w:instrText xml:space="preserve"> PAGEREF _Toc244369004 \h </w:instrText>
+          <w:instrText xml:space="preserve"> PAGEREF _Toc244370030 \h </w:instrText>
         </w:r>
         <w:r>
           <w:rPr>
@@ -11725,7 +11725,7 @@
           <w14:ligatures w14:val="standardContextual"/>
         </w:rPr>
       </w:pPr>
-      <w:hyperlink w:anchor="_Toc244369005" w:history="1">
+      <w:hyperlink w:anchor="_Toc244370031" w:history="1">
         <w:r>
           <w:rPr>
             <w:rStyle w:val="Hyperlink"/>
@@ -11760,7 +11760,7 @@
             <w:noProof/>
             <w:webHidden/>
           </w:rPr>
-          <w:instrText xml:space="preserve"> PAGEREF _Toc244369005 \h </w:instrText>
+          <w:instrText xml:space="preserve"> PAGEREF _Toc244370031 \h </w:instrText>
         </w:r>
         <w:r>
           <w:rPr>
@@ -11806,7 +11806,7 @@
           <w14:ligatures w14:val="standardContextual"/>
         </w:rPr>
       </w:pPr>
-      <w:hyperlink w:anchor="_Toc244369006" w:history="1">
+      <w:hyperlink w:anchor="_Toc244370032" w:history="1">
         <w:r>
           <w:rPr>
             <w:rStyle w:val="Hyperlink"/>
@@ -11841,7 +11841,7 @@
             <w:noProof/>
             <w:webHidden/>
           </w:rPr>
-          <w:instrText xml:space="preserve"> PAGEREF _Toc244369006 \h </w:instrText>
+          <w:instrText xml:space="preserve"> PAGEREF _Toc244370032 \h </w:instrText>
         </w:r>
         <w:r>
           <w:rPr>
@@ -11887,7 +11887,7 @@
           <w14:ligatures w14:val="standardContextual"/>
         </w:rPr>
       </w:pPr>
-      <w:hyperlink w:anchor="_Toc244369007" w:history="1">
+      <w:hyperlink w:anchor="_Toc244370033" w:history="1">
         <w:r>
           <w:rPr>
             <w:rStyle w:val="Hyperlink"/>
@@ -11922,7 +11922,7 @@
             <w:noProof/>
             <w:webHidden/>
           </w:rPr>
-          <w:instrText xml:space="preserve"> PAGEREF _Toc244369007 \h </w:instrText>
+          <w:instrText xml:space="preserve"> PAGEREF _Toc244370033 \h </w:instrText>
         </w:r>
         <w:r>
           <w:rPr>
@@ -11968,7 +11968,7 @@
           <w14:ligatures w14:val="standardContextual"/>
         </w:rPr>
       </w:pPr>
-      <w:hyperlink w:anchor="_Toc244369008" w:history="1">
+      <w:hyperlink w:anchor="_Toc244370034" w:history="1">
         <w:r>
           <w:rPr>
             <w:rStyle w:val="Hyperlink"/>
@@ -12003,7 +12003,7 @@
             <w:noProof/>
             <w:webHidden/>
           </w:rPr>
-          <w:instrText xml:space="preserve"> PAGEREF _Toc244369008 \h </w:instrText>
+          <w:instrText xml:space="preserve"> PAGEREF _Toc244370034 \h </w:instrText>
         </w:r>
         <w:r>
           <w:rPr>
@@ -12049,7 +12049,7 @@
           <w14:ligatures w14:val="standardContextual"/>
         </w:rPr>
       </w:pPr>
-      <w:hyperlink w:anchor="_Toc244369009" w:history="1">
+      <w:hyperlink w:anchor="_Toc244370035" w:history="1">
         <w:r>
           <w:rPr>
             <w:rStyle w:val="Hyperlink"/>
@@ -12084,7 +12084,7 @@
             <w:noProof/>
             <w:webHidden/>
           </w:rPr>
-          <w:instrText xml:space="preserve"> PAGEREF _Toc244369009 \h </w:instrText>
+          <w:instrText xml:space="preserve"> PAGEREF _Toc244370035 \h </w:instrText>
         </w:r>
         <w:r>
           <w:rPr>
@@ -12130,7 +12130,7 @@
           <w14:ligatures w14:val="standardContextual"/>
         </w:rPr>
       </w:pPr>
-      <w:hyperlink w:anchor="_Toc244369010" w:history="1">
+      <w:hyperlink w:anchor="_Toc244370036" w:history="1">
         <w:r>
           <w:rPr>
             <w:rStyle w:val="Hyperlink"/>
@@ -12165,7 +12165,7 @@
             <w:noProof/>
             <w:webHidden/>
           </w:rPr>
-          <w:instrText xml:space="preserve"> PAGEREF _Toc244369010 \h </w:instrText>
+          <w:instrText xml:space="preserve"> PAGEREF _Toc244370036 \h </w:instrText>
         </w:r>
         <w:r>
           <w:rPr>
@@ -12211,7 +12211,7 @@
           <w14:ligatures w14:val="standardContextual"/>
         </w:rPr>
       </w:pPr>
-      <w:hyperlink w:anchor="_Toc244369011" w:history="1">
+      <w:hyperlink w:anchor="_Toc244370037" w:history="1">
         <w:r>
           <w:rPr>
             <w:rStyle w:val="Hyperlink"/>
@@ -12246,7 +12246,7 @@
             <w:noProof/>
             <w:webHidden/>
           </w:rPr>
-          <w:instrText xml:space="preserve"> PAGEREF _Toc244369011 \h </w:instrText>
+          <w:instrText xml:space="preserve"> PAGEREF _Toc244370037 \h </w:instrText>
         </w:r>
         <w:r>
           <w:rPr>
@@ -12292,7 +12292,7 @@
           <w14:ligatures w14:val="standardContextual"/>
         </w:rPr>
       </w:pPr>
-      <w:hyperlink w:anchor="_Toc244369012" w:history="1">
+      <w:hyperlink w:anchor="_Toc244370038" w:history="1">
         <w:r>
           <w:rPr>
             <w:rStyle w:val="Hyperlink"/>
@@ -12327,7 +12327,7 @@
             <w:noProof/>
             <w:webHidden/>
           </w:rPr>
-          <w:instrText xml:space="preserve"> PAGEREF _Toc244369012 \h </w:instrText>
+          <w:instrText xml:space="preserve"> PAGEREF _Toc244370038 \h </w:instrText>
         </w:r>
         <w:r>
           <w:rPr>
@@ -12373,7 +12373,7 @@
           <w14:ligatures w14:val="standardContextual"/>
         </w:rPr>
       </w:pPr>
-      <w:hyperlink w:anchor="_Toc244369013" w:history="1">
+      <w:hyperlink w:anchor="_Toc244370039" w:history="1">
         <w:r>
           <w:rPr>
             <w:rStyle w:val="Hyperlink"/>
@@ -12408,7 +12408,7 @@
             <w:noProof/>
             <w:webHidden/>
           </w:rPr>
-          <w:instrText xml:space="preserve"> PAGEREF _Toc244369013 \h </w:instrText>
+          <w:instrText xml:space="preserve"> PAGEREF _Toc244370039 \h </w:instrText>
         </w:r>
         <w:r>
           <w:rPr>
@@ -12454,7 +12454,7 @@
           <w14:ligatures w14:val="standardContextual"/>
         </w:rPr>
       </w:pPr>
-      <w:hyperlink w:anchor="_Toc244369014" w:history="1">
+      <w:hyperlink w:anchor="_Toc244370040" w:history="1">
         <w:r>
           <w:rPr>
             <w:rStyle w:val="Hyperlink"/>
@@ -12489,7 +12489,7 @@
             <w:noProof/>
             <w:webHidden/>
           </w:rPr>
-          <w:instrText xml:space="preserve"> PAGEREF _Toc244369014 \h </w:instrText>
+          <w:instrText xml:space="preserve"> PAGEREF _Toc244370040 \h </w:instrText>
         </w:r>
         <w:r>
           <w:rPr>
@@ -12535,7 +12535,7 @@
           <w14:ligatures w14:val="standardContextual"/>
         </w:rPr>
       </w:pPr>
-      <w:hyperlink w:anchor="_Toc244369015" w:history="1">
+      <w:hyperlink w:anchor="_Toc244370041" w:history="1">
         <w:r>
           <w:rPr>
             <w:rStyle w:val="Hyperlink"/>
@@ -12570,7 +12570,7 @@
             <w:noProof/>
             <w:webHidden/>
           </w:rPr>
-          <w:instrText xml:space="preserve"> PAGEREF _Toc244369015 \h </w:instrText>
+          <w:instrText xml:space="preserve"> PAGEREF _Toc244370041 \h </w:instrText>
         </w:r>
         <w:r>
           <w:rPr>
@@ -12616,7 +12616,7 @@
           <w14:ligatures w14:val="standardContextual"/>
         </w:rPr>
       </w:pPr>
-      <w:hyperlink w:anchor="_Toc244369016" w:history="1">
+      <w:hyperlink w:anchor="_Toc244370042" w:history="1">
         <w:r>
           <w:rPr>
             <w:rStyle w:val="Hyperlink"/>
@@ -12651,7 +12651,7 @@
             <w:noProof/>
             <w:webHidden/>
           </w:rPr>
-          <w:instrText xml:space="preserve"> PAGEREF _Toc244369016 \h </w:instrText>
+          <w:instrText xml:space="preserve"> PAGEREF _Toc244370042 \h </w:instrText>
         </w:r>
         <w:r>
           <w:rPr>
@@ -12697,7 +12697,7 @@
           <w14:ligatures w14:val="standardContextual"/>
         </w:rPr>
       </w:pPr>
-      <w:hyperlink w:anchor="_Toc244369017" w:history="1">
+      <w:hyperlink w:anchor="_Toc244370043" w:history="1">
         <w:r>
           <w:rPr>
             <w:rStyle w:val="Hyperlink"/>
@@ -12732,7 +12732,7 @@
             <w:noProof/>
             <w:webHidden/>
           </w:rPr>
-          <w:instrText xml:space="preserve"> PAGEREF _Toc244369017 \h </w:instrText>
+          <w:instrText xml:space="preserve"> PAGEREF _Toc244370043 \h </w:instrText>
         </w:r>
         <w:r>
           <w:rPr>
@@ -12778,7 +12778,7 @@
           <w14:ligatures w14:val="standardContextual"/>
         </w:rPr>
       </w:pPr>
-      <w:hyperlink w:anchor="_Toc244369018" w:history="1">
+      <w:hyperlink w:anchor="_Toc244370044" w:history="1">
         <w:r>
           <w:rPr>
             <w:rStyle w:val="Hyperlink"/>
@@ -12813,7 +12813,7 @@
             <w:noProof/>
             <w:webHidden/>
           </w:rPr>
-          <w:instrText xml:space="preserve"> PAGEREF _Toc244369018 \h </w:instrText>
+          <w:instrText xml:space="preserve"> PAGEREF _Toc244370044 \h </w:instrText>
         </w:r>
         <w:r>
           <w:rPr>
@@ -12859,7 +12859,7 @@
           <w14:ligatures w14:val="standardContextual"/>
         </w:rPr>
       </w:pPr>
-      <w:hyperlink w:anchor="_Toc244369019" w:history="1">
+      <w:hyperlink w:anchor="_Toc244370045" w:history="1">
         <w:r>
           <w:rPr>
             <w:rStyle w:val="Hyperlink"/>
@@ -12894,7 +12894,7 @@
             <w:noProof/>
             <w:webHidden/>
           </w:rPr>
-          <w:instrText xml:space="preserve"> PAGEREF _Toc244369019 \h </w:instrText>
+          <w:instrText xml:space="preserve"> PAGEREF _Toc244370045 \h </w:instrText>
         </w:r>
         <w:r>
           <w:rPr>
@@ -12940,7 +12940,7 @@
           <w14:ligatures w14:val="standardContextual"/>
         </w:rPr>
       </w:pPr>
-      <w:hyperlink w:anchor="_Toc244369020" w:history="1">
+      <w:hyperlink w:anchor="_Toc244370046" w:history="1">
         <w:r>
           <w:rPr>
             <w:rStyle w:val="Hyperlink"/>
@@ -12975,7 +12975,7 @@
             <w:noProof/>
             <w:webHidden/>
           </w:rPr>
-          <w:instrText xml:space="preserve"> PAGEREF _Toc244369020 \h </w:instrText>
+          <w:instrText xml:space="preserve"> PAGEREF _Toc244370046 \h </w:instrText>
         </w:r>
         <w:r>
           <w:rPr>
@@ -13021,7 +13021,7 @@
           <w14:ligatures w14:val="standardContextual"/>
         </w:rPr>
       </w:pPr>
-      <w:hyperlink w:anchor="_Toc244369021" w:history="1">
+      <w:hyperlink w:anchor="_Toc244370047" w:history="1">
         <w:r>
           <w:rPr>
             <w:rStyle w:val="Hyperlink"/>
@@ -13056,7 +13056,7 @@
             <w:noProof/>
             <w:webHidden/>
           </w:rPr>
-          <w:instrText xml:space="preserve"> PAGEREF _Toc244369021 \h </w:instrText>
+          <w:instrText xml:space="preserve"> PAGEREF _Toc244370047 \h </w:instrText>
         </w:r>
         <w:r>
           <w:rPr>
@@ -13102,7 +13102,7 @@
           <w14:ligatures w14:val="standardContextual"/>
         </w:rPr>
       </w:pPr>
-      <w:hyperlink w:anchor="_Toc244369022" w:history="1">
+      <w:hyperlink w:anchor="_Toc244370048" w:history="1">
         <w:r>
           <w:rPr>
             <w:rStyle w:val="Hyperlink"/>
@@ -13137,7 +13137,7 @@
             <w:noProof/>
             <w:webHidden/>
           </w:rPr>
-          <w:instrText xml:space="preserve"> PAGEREF _Toc244369022 \h </w:instrText>
+          <w:instrText xml:space="preserve"> PAGEREF _Toc244370048 \h </w:instrText>
         </w:r>
         <w:r>
           <w:rPr>
@@ -13187,7 +13187,7 @@
       <w:pPr>
         <w:pStyle w:val="RListTitle"/>
       </w:pPr>
-      <w:bookmarkStart w:id="13" w:name="_Toc244368885"/>
+      <w:bookmarkStart w:id="13" w:name="_Toc244369911"/>
       <w:r>
         <w:t>LIST OF SYMBOLS, ABBREVIATIONS AND NOTATIONS</w:t>
       </w:r>
@@ -14055,7 +14055,7 @@
       <w:pPr>
         <w:pStyle w:val="RChapter"/>
       </w:pPr>
-      <w:bookmarkStart w:id="14" w:name="_Toc244368886"/>
+      <w:bookmarkStart w:id="14" w:name="_Toc244369912"/>
       <w:r>
         <w:lastRenderedPageBreak/>
         <w:t>CHAPTER 1</w:t>
@@ -14070,7 +14070,7 @@
       <w:pPr>
         <w:pStyle w:val="RSection"/>
       </w:pPr>
-      <w:bookmarkStart w:id="15" w:name="_Toc244368887"/>
+      <w:bookmarkStart w:id="15" w:name="_Toc244369913"/>
       <w:r>
         <w:t>1.1 PROBLEM STATEMENT</w:t>
       </w:r>
@@ -14096,7 +14096,7 @@
       <w:pPr>
         <w:pStyle w:val="RSection"/>
       </w:pPr>
-      <w:bookmarkStart w:id="16" w:name="_Toc244368888"/>
+      <w:bookmarkStart w:id="16" w:name="_Toc244369914"/>
       <w:r>
         <w:t>1.2 OBJECTIVES</w:t>
       </w:r>
@@ -14175,14 +14175,14 @@
         </w:numPr>
       </w:pPr>
       <w:r>
-        <w:t>Provide an interactive Gradio demonstration of the clean, poisoned and defended answers together with the results table.</w:t>
+        <w:t>Provide an interactive Gradio demonstration in which one call runs every defense on the same retrieved chunks and reports which of them returned the correct answer, together with the results table.</w:t>
       </w:r>
     </w:p>
     <w:p>
       <w:pPr>
         <w:pStyle w:val="RSection"/>
       </w:pPr>
-      <w:bookmarkStart w:id="17" w:name="_Toc244368889"/>
+      <w:bookmarkStart w:id="17" w:name="_Toc244369915"/>
       <w:r>
         <w:t>1.3 SCOPE</w:t>
       </w:r>
@@ -14220,7 +14220,7 @@
       <w:pPr>
         <w:pStyle w:val="RSection"/>
       </w:pPr>
-      <w:bookmarkStart w:id="18" w:name="_Toc244368890"/>
+      <w:bookmarkStart w:id="18" w:name="_Toc244369916"/>
       <w:r>
         <w:t>1.4 PLATFORM SPECIFICATION</w:t>
       </w:r>
@@ -14230,7 +14230,7 @@
       <w:pPr>
         <w:pStyle w:val="RSubsubsection"/>
       </w:pPr>
-      <w:bookmarkStart w:id="19" w:name="_Toc244368891"/>
+      <w:bookmarkStart w:id="19" w:name="_Toc244369917"/>
       <w:r>
         <w:t>1.4.1 Hardware</w:t>
       </w:r>
@@ -14248,7 +14248,7 @@
       <w:pPr>
         <w:pStyle w:val="RTblCaption"/>
       </w:pPr>
-      <w:bookmarkStart w:id="20" w:name="_Toc244368997"/>
+      <w:bookmarkStart w:id="20" w:name="_Toc244370023"/>
       <w:r>
         <w:rPr>
           <w:b/>
@@ -14643,9 +14643,8 @@
       <w:pPr>
         <w:pStyle w:val="RSubsubsection"/>
       </w:pPr>
-      <w:bookmarkStart w:id="21" w:name="_Toc244368892"/>
-      <w:r>
-        <w:lastRenderedPageBreak/>
+      <w:bookmarkStart w:id="21" w:name="_Toc244369918"/>
+      <w:r>
         <w:t>1.4.2 Software</w:t>
       </w:r>
       <w:bookmarkEnd w:id="21"/>
@@ -14692,7 +14691,7 @@
       <w:pPr>
         <w:pStyle w:val="RSubsubsection"/>
       </w:pPr>
-      <w:bookmarkStart w:id="22" w:name="_Toc244368893"/>
+      <w:bookmarkStart w:id="22" w:name="_Toc244369919"/>
       <w:r>
         <w:t>1.4.3 Implementation Language</w:t>
       </w:r>
@@ -14703,7 +14702,7 @@
         <w:pStyle w:val="RBody"/>
       </w:pPr>
       <w:r>
-        <w:t xml:space="preserve">Everything is written in Python (909 lines across six files: </w:t>
+        <w:t xml:space="preserve">Everything is written in Python (1,428 lines across eight files: </w:t>
       </w:r>
       <w:r>
         <w:rPr>
@@ -14731,6 +14730,26 @@
           <w:sz w:val="21"/>
         </w:rPr>
         <w:t>defense.py</w:t>
+      </w:r>
+      <w:r>
+        <w:t xml:space="preserve">, </w:t>
+      </w:r>
+      <w:r>
+        <w:rPr>
+          <w:rFonts w:ascii="Courier New" w:eastAsia="Courier New" w:hAnsi="Courier New" w:cs="Courier New"/>
+          <w:sz w:val="21"/>
+        </w:rPr>
+        <w:t>plots.py</w:t>
+      </w:r>
+      <w:r>
+        <w:t xml:space="preserve">, </w:t>
+      </w:r>
+      <w:r>
+        <w:rPr>
+          <w:rFonts w:ascii="Courier New" w:eastAsia="Courier New" w:hAnsi="Courier New" w:cs="Courier New"/>
+          <w:sz w:val="21"/>
+        </w:rPr>
+        <w:t>overlap_stats.py</w:t>
       </w:r>
       <w:r>
         <w:t xml:space="preserve">, </w:t>
@@ -14815,7 +14834,7 @@
       <w:pPr>
         <w:pStyle w:val="RFigCaption"/>
       </w:pPr>
-      <w:bookmarkStart w:id="23" w:name="_Toc244368977"/>
+      <w:bookmarkStart w:id="23" w:name="_Toc244370003"/>
       <w:r>
         <w:rPr>
           <w:b/>
@@ -14839,7 +14858,7 @@
       <w:pPr>
         <w:pStyle w:val="RChapter"/>
       </w:pPr>
-      <w:bookmarkStart w:id="24" w:name="_Toc244368894"/>
+      <w:bookmarkStart w:id="24" w:name="_Toc244369920"/>
       <w:r>
         <w:lastRenderedPageBreak/>
         <w:t>CHAPTER 2</w:t>
@@ -14854,7 +14873,7 @@
       <w:pPr>
         <w:pStyle w:val="RSection"/>
       </w:pPr>
-      <w:bookmarkStart w:id="25" w:name="_Toc244368895"/>
+      <w:bookmarkStart w:id="25" w:name="_Toc244369921"/>
       <w:r>
         <w:t>2.1 IDENTIFICATION OF NEED</w:t>
       </w:r>
@@ -14886,7 +14905,7 @@
       <w:pPr>
         <w:pStyle w:val="RSection"/>
       </w:pPr>
-      <w:bookmarkStart w:id="26" w:name="_Toc244368896"/>
+      <w:bookmarkStart w:id="26" w:name="_Toc244369922"/>
       <w:r>
         <w:t>2.2 PRELIMINARY INVESTIGATION</w:t>
       </w:r>
@@ -14904,7 +14923,7 @@
       <w:pPr>
         <w:pStyle w:val="RTblCaption"/>
       </w:pPr>
-      <w:bookmarkStart w:id="27" w:name="_Toc244368998"/>
+      <w:bookmarkStart w:id="27" w:name="_Toc244370024"/>
       <w:r>
         <w:rPr>
           <w:b/>
@@ -15171,7 +15190,7 @@
       <w:pPr>
         <w:pStyle w:val="RChapter"/>
       </w:pPr>
-      <w:bookmarkStart w:id="28" w:name="_Toc244368897"/>
+      <w:bookmarkStart w:id="28" w:name="_Toc244369923"/>
       <w:r>
         <w:lastRenderedPageBreak/>
         <w:t>CHAPTER 3</w:t>
@@ -15186,7 +15205,7 @@
       <w:pPr>
         <w:pStyle w:val="RSection"/>
       </w:pPr>
-      <w:bookmarkStart w:id="29" w:name="_Toc244368898"/>
+      <w:bookmarkStart w:id="29" w:name="_Toc244369924"/>
       <w:r>
         <w:t>3.1 TECHNICAL FEASIBILITY</w:t>
       </w:r>
@@ -15214,7 +15233,7 @@
       <w:pPr>
         <w:pStyle w:val="RSection"/>
       </w:pPr>
-      <w:bookmarkStart w:id="30" w:name="_Toc244368899"/>
+      <w:bookmarkStart w:id="30" w:name="_Toc244369925"/>
       <w:r>
         <w:t>3.2 ECONOMICAL FEASIBILITY</w:t>
       </w:r>
@@ -15232,7 +15251,7 @@
       <w:pPr>
         <w:pStyle w:val="RTblCaption"/>
       </w:pPr>
-      <w:bookmarkStart w:id="31" w:name="_Toc244368999"/>
+      <w:bookmarkStart w:id="31" w:name="_Toc244370025"/>
       <w:r>
         <w:rPr>
           <w:b/>
@@ -15585,7 +15604,7 @@
       <w:pPr>
         <w:pStyle w:val="RSection"/>
       </w:pPr>
-      <w:bookmarkStart w:id="32" w:name="_Toc244368900"/>
+      <w:bookmarkStart w:id="32" w:name="_Toc244369926"/>
       <w:r>
         <w:t>3.3 OPERATIONAL FEASIBILITY</w:t>
       </w:r>
@@ -15623,7 +15642,7 @@
       <w:pPr>
         <w:pStyle w:val="RChapter"/>
       </w:pPr>
-      <w:bookmarkStart w:id="33" w:name="_Toc244368901"/>
+      <w:bookmarkStart w:id="33" w:name="_Toc244369927"/>
       <w:r>
         <w:lastRenderedPageBreak/>
         <w:t>CHAPTER 4</w:t>
@@ -15638,7 +15657,7 @@
       <w:pPr>
         <w:pStyle w:val="RSection"/>
       </w:pPr>
-      <w:bookmarkStart w:id="34" w:name="_Toc244368902"/>
+      <w:bookmarkStart w:id="34" w:name="_Toc244369928"/>
       <w:r>
         <w:t>4.1 WORK DONE BY OTHERS</w:t>
       </w:r>
@@ -15690,7 +15709,7 @@
       <w:pPr>
         <w:pStyle w:val="RTblCaption"/>
       </w:pPr>
-      <w:bookmarkStart w:id="35" w:name="_Toc244369000"/>
+      <w:bookmarkStart w:id="35" w:name="_Toc244370026"/>
       <w:r>
         <w:rPr>
           <w:b/>
@@ -16183,7 +16202,7 @@
       <w:pPr>
         <w:pStyle w:val="RSection"/>
       </w:pPr>
-      <w:bookmarkStart w:id="36" w:name="_Toc244368903"/>
+      <w:bookmarkStart w:id="36" w:name="_Toc244369929"/>
       <w:r>
         <w:t>4.2 BENEFITS</w:t>
       </w:r>
@@ -16241,7 +16260,7 @@
       <w:pPr>
         <w:pStyle w:val="RSection"/>
       </w:pPr>
-      <w:bookmarkStart w:id="37" w:name="_Toc244368904"/>
+      <w:bookmarkStart w:id="37" w:name="_Toc244369930"/>
       <w:r>
         <w:t>4.3 PROPOSED SOLUTION</w:t>
       </w:r>
@@ -16259,7 +16278,7 @@
       <w:pPr>
         <w:pStyle w:val="RSection"/>
       </w:pPr>
-      <w:bookmarkStart w:id="38" w:name="_Toc244368905"/>
+      <w:bookmarkStart w:id="38" w:name="_Toc244369931"/>
       <w:r>
         <w:lastRenderedPageBreak/>
         <w:t>4.4 TECHNOLOGY USED</w:t>
@@ -16378,7 +16397,7 @@
       <w:pPr>
         <w:pStyle w:val="RChapter"/>
       </w:pPr>
-      <w:bookmarkStart w:id="39" w:name="_Toc244368906"/>
+      <w:bookmarkStart w:id="39" w:name="_Toc244369932"/>
       <w:r>
         <w:lastRenderedPageBreak/>
         <w:t>CHAPTER 5</w:t>
@@ -16393,7 +16412,7 @@
       <w:pPr>
         <w:pStyle w:val="RSection"/>
       </w:pPr>
-      <w:bookmarkStart w:id="40" w:name="_Toc244368907"/>
+      <w:bookmarkStart w:id="40" w:name="_Toc244369933"/>
       <w:r>
         <w:t>5.1 CONCEPT</w:t>
       </w:r>
@@ -16403,7 +16422,7 @@
       <w:pPr>
         <w:pStyle w:val="RSubsubsection"/>
       </w:pPr>
-      <w:bookmarkStart w:id="41" w:name="_Toc244368908"/>
+      <w:bookmarkStart w:id="41" w:name="_Toc244369934"/>
       <w:r>
         <w:t>5.1.1 The RAG Pipeline</w:t>
       </w:r>
@@ -16421,7 +16440,7 @@
       <w:pPr>
         <w:pStyle w:val="RSubsubsection"/>
       </w:pPr>
-      <w:bookmarkStart w:id="42" w:name="_Toc244368909"/>
+      <w:bookmarkStart w:id="42" w:name="_Toc244369935"/>
       <w:r>
         <w:t>5.1.2 Threat Model</w:t>
       </w:r>
@@ -16484,7 +16503,7 @@
       <w:pPr>
         <w:pStyle w:val="RFigCaption"/>
       </w:pPr>
-      <w:bookmarkStart w:id="43" w:name="_Toc244368978"/>
+      <w:bookmarkStart w:id="43" w:name="_Toc244370004"/>
       <w:r>
         <w:rPr>
           <w:b/>
@@ -16500,7 +16519,7 @@
       <w:pPr>
         <w:pStyle w:val="RSubsubsection"/>
       </w:pPr>
-      <w:bookmarkStart w:id="44" w:name="_Toc244368910"/>
+      <w:bookmarkStart w:id="44" w:name="_Toc244369936"/>
       <w:r>
         <w:lastRenderedPageBreak/>
         <w:t>5.1.3 Dataset</w:t>
@@ -16519,7 +16538,7 @@
       <w:pPr>
         <w:pStyle w:val="RTblCaption"/>
       </w:pPr>
-      <w:bookmarkStart w:id="45" w:name="_Toc244369001"/>
+      <w:bookmarkStart w:id="45" w:name="_Toc244370027"/>
       <w:r>
         <w:rPr>
           <w:b/>
@@ -16846,7 +16865,7 @@
       <w:pPr>
         <w:pStyle w:val="RTblCaption"/>
       </w:pPr>
-      <w:bookmarkStart w:id="46" w:name="_Toc244369002"/>
+      <w:bookmarkStart w:id="46" w:name="_Toc244370028"/>
       <w:r>
         <w:rPr>
           <w:b/>
@@ -17037,7 +17056,7 @@
       <w:pPr>
         <w:pStyle w:val="RSubsubsection"/>
       </w:pPr>
-      <w:bookmarkStart w:id="47" w:name="_Toc244368911"/>
+      <w:bookmarkStart w:id="47" w:name="_Toc244369937"/>
       <w:r>
         <w:t>5.1.4 Metrics</w:t>
       </w:r>
@@ -17178,7 +17197,7 @@
       <w:pPr>
         <w:pStyle w:val="RSubsubsection"/>
       </w:pPr>
-      <w:bookmarkStart w:id="48" w:name="_Toc244368912"/>
+      <w:bookmarkStart w:id="48" w:name="_Toc244369938"/>
       <w:r>
         <w:t>5.1.5 Defenses and the Adaptive Attacker</w:t>
       </w:r>
@@ -17290,7 +17309,7 @@
       <w:pPr>
         <w:pStyle w:val="RSection"/>
       </w:pPr>
-      <w:bookmarkStart w:id="49" w:name="_Toc244368913"/>
+      <w:bookmarkStart w:id="49" w:name="_Toc244369939"/>
       <w:r>
         <w:t>5.2 APPLICATION AREA</w:t>
       </w:r>
@@ -17348,7 +17367,7 @@
       <w:pPr>
         <w:pStyle w:val="RChapter"/>
       </w:pPr>
-      <w:bookmarkStart w:id="50" w:name="_Toc244368914"/>
+      <w:bookmarkStart w:id="50" w:name="_Toc244369940"/>
       <w:r>
         <w:lastRenderedPageBreak/>
         <w:t>CHAPTER 6</w:t>
@@ -17363,7 +17382,7 @@
       <w:pPr>
         <w:pStyle w:val="RSection"/>
       </w:pPr>
-      <w:bookmarkStart w:id="51" w:name="_Toc244368915"/>
+      <w:bookmarkStart w:id="51" w:name="_Toc244369941"/>
       <w:r>
         <w:t>6.1 SOFTWARE ENGINEERING PARADIGM APPLIED</w:t>
       </w:r>
@@ -17373,7 +17392,7 @@
       <w:pPr>
         <w:pStyle w:val="RSubsubsection"/>
       </w:pPr>
-      <w:bookmarkStart w:id="52" w:name="_Toc244368916"/>
+      <w:bookmarkStart w:id="52" w:name="_Toc244369942"/>
       <w:r>
         <w:t>6.1.1 Description</w:t>
       </w:r>
@@ -17436,7 +17455,7 @@
       <w:pPr>
         <w:pStyle w:val="RFigCaption"/>
       </w:pPr>
-      <w:bookmarkStart w:id="53" w:name="_Toc244368979"/>
+      <w:bookmarkStart w:id="53" w:name="_Toc244370005"/>
       <w:r>
         <w:rPr>
           <w:b/>
@@ -17452,7 +17471,7 @@
       <w:pPr>
         <w:pStyle w:val="RSubsubsection"/>
       </w:pPr>
-      <w:bookmarkStart w:id="54" w:name="_Toc244368917"/>
+      <w:bookmarkStart w:id="54" w:name="_Toc244369943"/>
       <w:r>
         <w:t>6.1.2 Advantages &amp; Disadvantages</w:t>
       </w:r>
@@ -17485,7 +17504,7 @@
       <w:pPr>
         <w:pStyle w:val="RSubsubsection"/>
       </w:pPr>
-      <w:bookmarkStart w:id="55" w:name="_Toc244368918"/>
+      <w:bookmarkStart w:id="55" w:name="_Toc244369944"/>
       <w:r>
         <w:t>6.1.3 Reasons for Use</w:t>
       </w:r>
@@ -17503,7 +17522,7 @@
       <w:pPr>
         <w:pStyle w:val="RSection"/>
       </w:pPr>
-      <w:bookmarkStart w:id="56" w:name="_Toc244368919"/>
+      <w:bookmarkStart w:id="56" w:name="_Toc244369945"/>
       <w:r>
         <w:lastRenderedPageBreak/>
         <w:t>6.2 REQUIREMENT ANALYSIS</w:t>
@@ -17514,7 +17533,7 @@
       <w:pPr>
         <w:pStyle w:val="RSubsubsection"/>
       </w:pPr>
-      <w:bookmarkStart w:id="57" w:name="_Toc244368920"/>
+      <w:bookmarkStart w:id="57" w:name="_Toc244369946"/>
       <w:r>
         <w:t>6.2.1 Software Requirements Specification</w:t>
       </w:r>
@@ -17538,7 +17557,7 @@
       <w:pPr>
         <w:pStyle w:val="RTblCaption"/>
       </w:pPr>
-      <w:bookmarkStart w:id="58" w:name="_Toc244369003"/>
+      <w:bookmarkStart w:id="58" w:name="_Toc244370029"/>
       <w:r>
         <w:rPr>
           <w:b/>
@@ -17928,7 +17947,7 @@
               <w:keepNext/>
             </w:pPr>
             <w:r>
-              <w:t>Provide a web interface to ask, inject, defend, view the retrieved chunks and view the results table.</w:t>
+              <w:t>Provide a web interface that runs every defense on one question and attacker with a single action, reports which defenses returned the correct answer, and shows the results table.</w:t>
             </w:r>
           </w:p>
         </w:tc>
@@ -17977,7 +17996,7 @@
       <w:pPr>
         <w:pStyle w:val="RTblCaption"/>
       </w:pPr>
-      <w:bookmarkStart w:id="59" w:name="_Toc244369004"/>
+      <w:bookmarkStart w:id="59" w:name="_Toc244370030"/>
       <w:r>
         <w:rPr>
           <w:b/>
@@ -18428,7 +18447,7 @@
       <w:pPr>
         <w:pStyle w:val="RLevel5"/>
       </w:pPr>
-      <w:bookmarkStart w:id="60" w:name="_Toc244368921"/>
+      <w:bookmarkStart w:id="60" w:name="_Toc244369947"/>
       <w:r>
         <w:lastRenderedPageBreak/>
         <w:t>6.2.1.1 Glossary</w:t>
@@ -18439,7 +18458,7 @@
       <w:pPr>
         <w:pStyle w:val="RTblCaption"/>
       </w:pPr>
-      <w:bookmarkStart w:id="61" w:name="_Toc244369005"/>
+      <w:bookmarkStart w:id="61" w:name="_Toc244370031"/>
       <w:r>
         <w:rPr>
           <w:b/>
@@ -18800,7 +18819,7 @@
       <w:pPr>
         <w:pStyle w:val="RLevel5"/>
       </w:pPr>
-      <w:bookmarkStart w:id="62" w:name="_Toc244368922"/>
+      <w:bookmarkStart w:id="62" w:name="_Toc244369948"/>
       <w:r>
         <w:t>6.2.1.2 Supplementary Specifications</w:t>
       </w:r>
@@ -18882,7 +18901,7 @@
       <w:pPr>
         <w:pStyle w:val="RLevel5"/>
       </w:pPr>
-      <w:bookmarkStart w:id="63" w:name="_Toc244368923"/>
+      <w:bookmarkStart w:id="63" w:name="_Toc244369949"/>
       <w:r>
         <w:t>6.2.1.3 Use Case Model</w:t>
       </w:r>
@@ -18946,7 +18965,7 @@
       <w:pPr>
         <w:pStyle w:val="RFigCaption"/>
       </w:pPr>
-      <w:bookmarkStart w:id="64" w:name="_Toc244368980"/>
+      <w:bookmarkStart w:id="64" w:name="_Toc244370006"/>
       <w:r>
         <w:rPr>
           <w:b/>
@@ -18962,7 +18981,7 @@
       <w:pPr>
         <w:pStyle w:val="RTblCaption"/>
       </w:pPr>
-      <w:bookmarkStart w:id="65" w:name="_Toc244369006"/>
+      <w:bookmarkStart w:id="65" w:name="_Toc244370032"/>
       <w:r>
         <w:rPr>
           <w:b/>
@@ -19125,7 +19144,7 @@
               <w:keepNext/>
             </w:pPr>
             <w:r>
-              <w:t>Select question; system retrieves top-5; reader answers.</w:t>
+              <w:t>Select a question; the system retrieves the top-5 chunks and the reader answers without poison.</w:t>
             </w:r>
           </w:p>
         </w:tc>
@@ -19139,7 +19158,7 @@
               <w:keepNext/>
             </w:pPr>
             <w:r>
-              <w:t>Answer, verdict and retrieved chunks shown.</w:t>
+              <w:t>The reference answer is shown first in the results table.</w:t>
             </w:r>
           </w:p>
         </w:tc>
@@ -19187,7 +19206,7 @@
               <w:keepNext/>
             </w:pPr>
             <w:r>
-              <w:t>Choose 1, 3, 5 or 10; documents added to a copy of the index; question asked again.</w:t>
+              <w:t>Choose 1, 3, 5 or 10 and the attacker; the documents are added to a copy of the index.</w:t>
             </w:r>
           </w:p>
         </w:tc>
@@ -19201,7 +19220,7 @@
               <w:keepNext/>
             </w:pPr>
             <w:r>
-              <w:t>Answer often flips to the target.</w:t>
+              <w:t>The undefended answer often flips to the target.</w:t>
             </w:r>
           </w:p>
         </w:tc>
@@ -19221,7 +19240,7 @@
               <w:keepNext/>
             </w:pPr>
             <w:r>
-              <w:t>UC3 Enable defense</w:t>
+              <w:t>UC3 Run all defenses</w:t>
             </w:r>
           </w:p>
         </w:tc>
@@ -19249,7 +19268,7 @@
               <w:keepNext/>
             </w:pPr>
             <w:r>
-              <w:t>Choose the attacker (short stubs, padded or tampered copy) and the defense (provenance at four strengths, manifest, near-duplicate abstention, earliest-ingest-wins); question asked again with filtering.</w:t>
+              <w:t>Press one button; the candidates are retrieved once and every defense answers them, with a progress bar while the slow ones (voting) run.</w:t>
             </w:r>
           </w:p>
         </w:tc>
@@ -19263,7 +19282,7 @@
               <w:keepNext/>
             </w:pPr>
             <w:r>
-              <w:t>Answer restored or not; dropped chunks marked.</w:t>
+              <w:t>A table of every defense's answer and a summary of which returned the correct answer.</w:t>
             </w:r>
           </w:p>
         </w:tc>
@@ -19399,7 +19418,7 @@
       <w:pPr>
         <w:pStyle w:val="RSubsubsection"/>
       </w:pPr>
-      <w:bookmarkStart w:id="66" w:name="_Toc244368924"/>
+      <w:bookmarkStart w:id="66" w:name="_Toc244369950"/>
       <w:r>
         <w:lastRenderedPageBreak/>
         <w:t>6.2.2 Conceptual Level Activity Diagram</w:t>
@@ -19455,7 +19474,7 @@
       <w:pPr>
         <w:pStyle w:val="RFigCaption"/>
       </w:pPr>
-      <w:bookmarkStart w:id="67" w:name="_Toc244368981"/>
+      <w:bookmarkStart w:id="67" w:name="_Toc244370007"/>
       <w:r>
         <w:rPr>
           <w:b/>
@@ -19471,7 +19490,7 @@
       <w:pPr>
         <w:pStyle w:val="RSubsubsection"/>
       </w:pPr>
-      <w:bookmarkStart w:id="68" w:name="_Toc244368925"/>
+      <w:bookmarkStart w:id="68" w:name="_Toc244369951"/>
       <w:r>
         <w:t>6.2.3 Conceptual Level Sequence Diagram</w:t>
       </w:r>
@@ -19526,7 +19545,7 @@
       <w:pPr>
         <w:pStyle w:val="RFigCaption"/>
       </w:pPr>
-      <w:bookmarkStart w:id="69" w:name="_Toc244368982"/>
+      <w:bookmarkStart w:id="69" w:name="_Toc244370008"/>
       <w:r>
         <w:rPr>
           <w:b/>
@@ -19542,7 +19561,7 @@
       <w:pPr>
         <w:pStyle w:val="RSection"/>
       </w:pPr>
-      <w:bookmarkStart w:id="70" w:name="_Toc244368926"/>
+      <w:bookmarkStart w:id="70" w:name="_Toc244369952"/>
       <w:r>
         <w:t>6.3 PLANNING MANAGERIAL ISSUES</w:t>
       </w:r>
@@ -19552,7 +19571,7 @@
       <w:pPr>
         <w:pStyle w:val="RSubsubsection"/>
       </w:pPr>
-      <w:bookmarkStart w:id="71" w:name="_Toc244368927"/>
+      <w:bookmarkStart w:id="71" w:name="_Toc244369953"/>
       <w:r>
         <w:t>6.3.1 Planning Scope</w:t>
       </w:r>
@@ -19570,7 +19589,7 @@
       <w:pPr>
         <w:pStyle w:val="RSubsubsection"/>
       </w:pPr>
-      <w:bookmarkStart w:id="72" w:name="_Toc244368928"/>
+      <w:bookmarkStart w:id="72" w:name="_Toc244369954"/>
       <w:r>
         <w:lastRenderedPageBreak/>
         <w:t>6.3.2 Project Resources</w:t>
@@ -19581,7 +19600,7 @@
       <w:pPr>
         <w:pStyle w:val="RTblCaption"/>
       </w:pPr>
-      <w:bookmarkStart w:id="73" w:name="_Toc244369007"/>
+      <w:bookmarkStart w:id="73" w:name="_Toc244370033"/>
       <w:r>
         <w:rPr>
           <w:b/>
@@ -19806,7 +19825,7 @@
       <w:pPr>
         <w:pStyle w:val="RSubsubsection"/>
       </w:pPr>
-      <w:bookmarkStart w:id="74" w:name="_Toc244368929"/>
+      <w:bookmarkStart w:id="74" w:name="_Toc244369955"/>
       <w:r>
         <w:t>6.3.3 Team Organization</w:t>
       </w:r>
@@ -19824,7 +19843,7 @@
       <w:pPr>
         <w:pStyle w:val="RSubsubsection"/>
       </w:pPr>
-      <w:bookmarkStart w:id="75" w:name="_Toc244368930"/>
+      <w:bookmarkStart w:id="75" w:name="_Toc244369956"/>
       <w:r>
         <w:t>6.3.4 Project Scheduling</w:t>
       </w:r>
@@ -19834,7 +19853,7 @@
       <w:pPr>
         <w:pStyle w:val="RTblCaption"/>
       </w:pPr>
-      <w:bookmarkStart w:id="76" w:name="_Toc244369008"/>
+      <w:bookmarkStart w:id="76" w:name="_Toc244370034"/>
       <w:r>
         <w:rPr>
           <w:b/>
@@ -20616,10 +20635,75 @@
           <w:p>
             <w:pPr>
               <w:pStyle w:val="RTableText"/>
+              <w:keepNext/>
               <w:jc w:val="center"/>
             </w:pPr>
             <w:r>
               <w:t>10</w:t>
+            </w:r>
+          </w:p>
+        </w:tc>
+        <w:tc>
+          <w:tcPr>
+            <w:tcW w:w="3989" w:type="dxa"/>
+          </w:tcPr>
+          <w:p>
+            <w:pPr>
+              <w:pStyle w:val="RTableText"/>
+              <w:keepNext/>
+            </w:pPr>
+            <w:r>
+              <w:t>Single-call demonstration: every defense on one retrieval, summary of which returned the correct answer, docs and report update</w:t>
+            </w:r>
+          </w:p>
+        </w:tc>
+        <w:tc>
+          <w:tcPr>
+            <w:tcW w:w="1728" w:type="dxa"/>
+          </w:tcPr>
+          <w:p>
+            <w:pPr>
+              <w:pStyle w:val="RTableText"/>
+              <w:keepNext/>
+              <w:jc w:val="center"/>
+            </w:pPr>
+            <w:r>
+              <w:t>31 Oct 2026</w:t>
+            </w:r>
+          </w:p>
+        </w:tc>
+        <w:tc>
+          <w:tcPr>
+            <w:tcW w:w="1296" w:type="dxa"/>
+          </w:tcPr>
+          <w:p>
+            <w:pPr>
+              <w:pStyle w:val="RTableText"/>
+              <w:keepNext/>
+              <w:jc w:val="center"/>
+            </w:pPr>
+            <w:r>
+              <w:t>Done</w:t>
+            </w:r>
+          </w:p>
+        </w:tc>
+      </w:tr>
+      <w:tr>
+        <w:trPr>
+          <w:cantSplit/>
+          <w:jc w:val="center"/>
+        </w:trPr>
+        <w:tc>
+          <w:tcPr>
+            <w:tcW w:w="1296" w:type="dxa"/>
+          </w:tcPr>
+          <w:p>
+            <w:pPr>
+              <w:pStyle w:val="RTableText"/>
+              <w:jc w:val="center"/>
+            </w:pPr>
+            <w:r>
+              <w:t>11</w:t>
             </w:r>
           </w:p>
         </w:tc>
@@ -20676,7 +20760,7 @@
       <w:pPr>
         <w:pStyle w:val="RSubsubsection"/>
       </w:pPr>
-      <w:bookmarkStart w:id="77" w:name="_Toc244368931"/>
+      <w:bookmarkStart w:id="77" w:name="_Toc244369957"/>
       <w:r>
         <w:t>6.3.5 Estimation</w:t>
       </w:r>
@@ -20694,7 +20778,7 @@
       <w:pPr>
         <w:pStyle w:val="RTblCaption"/>
       </w:pPr>
-      <w:bookmarkStart w:id="78" w:name="_Toc244369009"/>
+      <w:bookmarkStart w:id="78" w:name="_Toc244370035"/>
       <w:r>
         <w:rPr>
           <w:b/>
@@ -20804,7 +20888,7 @@
               <w:keepNext/>
             </w:pPr>
             <w:r>
-              <w:t>1,389 lines in 8 files (attack 365, test_r2 261, defense 176, rag 147, plots 131, app 122, scrape 115, overlap_stats 72)</w:t>
+              <w:t>1,428 lines in 8 files (attack 365, test_r2 282, defense 189, rag 147, plots 131, app 127, scrape 115, overlap_stats 72)</w:t>
             </w:r>
           </w:p>
         </w:tc>
@@ -20954,7 +21038,7 @@
       <w:pPr>
         <w:pStyle w:val="RSubsubsection"/>
       </w:pPr>
-      <w:bookmarkStart w:id="79" w:name="_Toc244368932"/>
+      <w:bookmarkStart w:id="79" w:name="_Toc244369958"/>
       <w:r>
         <w:t>6.3.6 Risk Analysis</w:t>
       </w:r>
@@ -20964,7 +21048,7 @@
       <w:pPr>
         <w:pStyle w:val="RTblCaption"/>
       </w:pPr>
-      <w:bookmarkStart w:id="80" w:name="_Toc244369010"/>
+      <w:bookmarkStart w:id="80" w:name="_Toc244370036"/>
       <w:r>
         <w:rPr>
           <w:b/>
@@ -21408,7 +21492,7 @@
       <w:pPr>
         <w:pStyle w:val="RSubsubsection"/>
       </w:pPr>
-      <w:bookmarkStart w:id="81" w:name="_Toc244368933"/>
+      <w:bookmarkStart w:id="81" w:name="_Toc244369959"/>
       <w:r>
         <w:t>6.3.7 Security Plan</w:t>
       </w:r>
@@ -21436,7 +21520,7 @@
       <w:pPr>
         <w:pStyle w:val="RSubsubsection"/>
       </w:pPr>
-      <w:bookmarkStart w:id="82" w:name="_Toc244368934"/>
+      <w:bookmarkStart w:id="82" w:name="_Toc244369960"/>
       <w:r>
         <w:lastRenderedPageBreak/>
         <w:t>6.3.8 Configuration Management Plan</w:t>
@@ -21447,7 +21531,7 @@
       <w:pPr>
         <w:pStyle w:val="RTblCaption"/>
       </w:pPr>
-      <w:bookmarkStart w:id="83" w:name="_Toc244369011"/>
+      <w:bookmarkStart w:id="83" w:name="_Toc244370037"/>
       <w:r>
         <w:rPr>
           <w:b/>
@@ -22068,7 +22152,7 @@
       <w:pPr>
         <w:pStyle w:val="RSection"/>
       </w:pPr>
-      <w:bookmarkStart w:id="84" w:name="_Toc244368935"/>
+      <w:bookmarkStart w:id="84" w:name="_Toc244369961"/>
       <w:r>
         <w:t>6.4 DESIGN</w:t>
       </w:r>
@@ -22078,7 +22162,7 @@
       <w:pPr>
         <w:pStyle w:val="RSubsubsection"/>
       </w:pPr>
-      <w:bookmarkStart w:id="85" w:name="_Toc244368936"/>
+      <w:bookmarkStart w:id="85" w:name="_Toc244369962"/>
       <w:r>
         <w:t>6.4.1 Design Concept</w:t>
       </w:r>
@@ -22139,15 +22223,36 @@
         <w:t>ask_one</w:t>
       </w:r>
       <w:r>
-        <w:t xml:space="preserve"> retrieves and answers a single question and is shared by the sweeps and the interface, so the demonstration exercises exactly the code that produced the tables. Poison is added to a throwaway copy of the index for each question so that experiments never contaminate each other. A defense is a function with the same signature as the plain answer function, so any defense can be swapped in.</w:t>
+        <w:t xml:space="preserve"> retrieves and answers a single question and is shared by the sweeps and the interface, so the demonstration exercises exactly the code that produced the tables. Poison is added to a throwaway copy of the index for each question so that experiments never contaminate each other. A defense is a function with the same signature as the plain answer function, so any defense can be swapped in. The interface makes a single call: </w:t>
+      </w:r>
+      <w:r>
+        <w:rPr>
+          <w:rFonts w:ascii="Courier New" w:eastAsia="Courier New" w:hAnsi="Courier New" w:cs="Courier New"/>
+          <w:sz w:val="21"/>
+        </w:rPr>
+        <w:t>answer_all</w:t>
+      </w:r>
+      <w:r>
+        <w:t xml:space="preserve"> in </w:t>
+      </w:r>
+      <w:r>
+        <w:rPr>
+          <w:rFonts w:ascii="Courier New" w:eastAsia="Courier New" w:hAnsi="Courier New" w:cs="Courier New"/>
+          <w:sz w:val="21"/>
+        </w:rPr>
+        <w:t>defense.py</w:t>
+      </w:r>
+      <w:r>
+        <w:t xml:space="preserve"> retrieves the candidate chunks once and gives each defense the chunks it would receive in a sweep, so the answers come from the same cache entries as the tables.</w:t>
       </w:r>
     </w:p>
     <w:p>
       <w:pPr>
         <w:pStyle w:val="RSubsubsection"/>
       </w:pPr>
-      <w:bookmarkStart w:id="86" w:name="_Toc244368937"/>
-      <w:r>
+      <w:bookmarkStart w:id="86" w:name="_Toc244369963"/>
+      <w:r>
+        <w:lastRenderedPageBreak/>
         <w:t>6.4.2 Design Technique</w:t>
       </w:r>
       <w:bookmarkEnd w:id="86"/>
@@ -22174,9 +22279,8 @@
       <w:pPr>
         <w:pStyle w:val="RSubsubsection"/>
       </w:pPr>
-      <w:bookmarkStart w:id="87" w:name="_Toc244368938"/>
-      <w:r>
-        <w:lastRenderedPageBreak/>
+      <w:bookmarkStart w:id="87" w:name="_Toc244369964"/>
+      <w:r>
         <w:t>6.4.3 Modelling</w:t>
       </w:r>
       <w:bookmarkEnd w:id="87"/>
@@ -22185,7 +22289,7 @@
       <w:pPr>
         <w:pStyle w:val="RLevel5"/>
       </w:pPr>
-      <w:bookmarkStart w:id="88" w:name="_Toc244368939"/>
+      <w:bookmarkStart w:id="88" w:name="_Toc244369965"/>
       <w:r>
         <w:t>6.4.3.1 Detailed Class Diagram</w:t>
       </w:r>
@@ -22240,7 +22344,7 @@
       <w:pPr>
         <w:pStyle w:val="RFigCaption"/>
       </w:pPr>
-      <w:bookmarkStart w:id="89" w:name="_Toc244368983"/>
+      <w:bookmarkStart w:id="89" w:name="_Toc244370009"/>
       <w:r>
         <w:rPr>
           <w:b/>
@@ -22256,7 +22360,7 @@
       <w:pPr>
         <w:pStyle w:val="RLevel5"/>
       </w:pPr>
-      <w:bookmarkStart w:id="90" w:name="_Toc244368940"/>
+      <w:bookmarkStart w:id="90" w:name="_Toc244369966"/>
       <w:r>
         <w:lastRenderedPageBreak/>
         <w:t>6.4.3.2 Interaction Diagram</w:t>
@@ -22327,7 +22431,7 @@
       <w:pPr>
         <w:pStyle w:val="RFigCaption"/>
       </w:pPr>
-      <w:bookmarkStart w:id="91" w:name="_Toc244368984"/>
+      <w:bookmarkStart w:id="91" w:name="_Toc244370010"/>
       <w:r>
         <w:rPr>
           <w:b/>
@@ -22404,7 +22508,7 @@
       <w:pPr>
         <w:pStyle w:val="RFigCaption"/>
       </w:pPr>
-      <w:bookmarkStart w:id="92" w:name="_Toc244368985"/>
+      <w:bookmarkStart w:id="92" w:name="_Toc244370011"/>
       <w:r>
         <w:rPr>
           <w:b/>
@@ -22420,7 +22524,7 @@
       <w:pPr>
         <w:pStyle w:val="RLevel5"/>
       </w:pPr>
-      <w:bookmarkStart w:id="93" w:name="_Toc244368941"/>
+      <w:bookmarkStart w:id="93" w:name="_Toc244369967"/>
       <w:r>
         <w:t>6.4.3.3 State Diagram</w:t>
       </w:r>
@@ -22475,7 +22579,7 @@
       <w:pPr>
         <w:pStyle w:val="RFigCaption"/>
       </w:pPr>
-      <w:bookmarkStart w:id="94" w:name="_Toc244368986"/>
+      <w:bookmarkStart w:id="94" w:name="_Toc244370012"/>
       <w:r>
         <w:rPr>
           <w:b/>
@@ -22491,7 +22595,7 @@
       <w:pPr>
         <w:pStyle w:val="RLevel5"/>
       </w:pPr>
-      <w:bookmarkStart w:id="95" w:name="_Toc244368942"/>
+      <w:bookmarkStart w:id="95" w:name="_Toc244369968"/>
       <w:r>
         <w:lastRenderedPageBreak/>
         <w:t>6.4.3.4 Activity Diagram</w:t>
@@ -22547,7 +22651,7 @@
       <w:pPr>
         <w:pStyle w:val="RFigCaption"/>
       </w:pPr>
-      <w:bookmarkStart w:id="96" w:name="_Toc244368987"/>
+      <w:bookmarkStart w:id="96" w:name="_Toc244370013"/>
       <w:r>
         <w:rPr>
           <w:b/>
@@ -22563,7 +22667,7 @@
       <w:pPr>
         <w:pStyle w:val="RLevel5"/>
       </w:pPr>
-      <w:bookmarkStart w:id="97" w:name="_Toc244368943"/>
+      <w:bookmarkStart w:id="97" w:name="_Toc244369969"/>
       <w:r>
         <w:t>6.4.3.5 Object Diagram</w:t>
       </w:r>
@@ -22618,7 +22722,7 @@
       <w:pPr>
         <w:pStyle w:val="RFigCaption"/>
       </w:pPr>
-      <w:bookmarkStart w:id="98" w:name="_Toc244368988"/>
+      <w:bookmarkStart w:id="98" w:name="_Toc244370014"/>
       <w:r>
         <w:rPr>
           <w:b/>
@@ -22634,7 +22738,7 @@
       <w:pPr>
         <w:pStyle w:val="RLevel5"/>
       </w:pPr>
-      <w:bookmarkStart w:id="99" w:name="_Toc244368944"/>
+      <w:bookmarkStart w:id="99" w:name="_Toc244369970"/>
       <w:r>
         <w:lastRenderedPageBreak/>
         <w:t>6.4.3.6 Deployment Diagram</w:t>
@@ -22690,7 +22794,7 @@
       <w:pPr>
         <w:pStyle w:val="RFigCaption"/>
       </w:pPr>
-      <w:bookmarkStart w:id="100" w:name="_Toc244368989"/>
+      <w:bookmarkStart w:id="100" w:name="_Toc244370015"/>
       <w:r>
         <w:rPr>
           <w:b/>
@@ -22706,7 +22810,7 @@
       <w:pPr>
         <w:pStyle w:val="RLevel5"/>
       </w:pPr>
-      <w:bookmarkStart w:id="101" w:name="_Toc244368945"/>
+      <w:bookmarkStart w:id="101" w:name="_Toc244369971"/>
       <w:r>
         <w:t>6.4.3.7 Component Diagram</w:t>
       </w:r>
@@ -22761,7 +22865,7 @@
       <w:pPr>
         <w:pStyle w:val="RFigCaption"/>
       </w:pPr>
-      <w:bookmarkStart w:id="102" w:name="_Toc244368990"/>
+      <w:bookmarkStart w:id="102" w:name="_Toc244370016"/>
       <w:r>
         <w:rPr>
           <w:b/>
@@ -22777,7 +22881,7 @@
       <w:pPr>
         <w:pStyle w:val="RSection"/>
       </w:pPr>
-      <w:bookmarkStart w:id="103" w:name="_Toc244368946"/>
+      <w:bookmarkStart w:id="103" w:name="_Toc244369972"/>
       <w:r>
         <w:t>6.5 IMPLEMENTATION PHASE</w:t>
       </w:r>
@@ -22787,7 +22891,7 @@
       <w:pPr>
         <w:pStyle w:val="RSubsubsection"/>
       </w:pPr>
-      <w:bookmarkStart w:id="104" w:name="_Toc244368947"/>
+      <w:bookmarkStart w:id="104" w:name="_Toc244369973"/>
       <w:r>
         <w:t>6.5.1 Language Used Characteristics</w:t>
       </w:r>
@@ -22826,7 +22930,7 @@
       <w:pPr>
         <w:pStyle w:val="RSubsubsection"/>
       </w:pPr>
-      <w:bookmarkStart w:id="105" w:name="_Toc244368948"/>
+      <w:bookmarkStart w:id="105" w:name="_Toc244369974"/>
       <w:r>
         <w:t>6.5.2 Coding</w:t>
       </w:r>
@@ -23204,7 +23308,7 @@
       <w:pPr>
         <w:pStyle w:val="RSubsubsection"/>
       </w:pPr>
-      <w:bookmarkStart w:id="106" w:name="_Toc244368949"/>
+      <w:bookmarkStart w:id="106" w:name="_Toc244369975"/>
       <w:r>
         <w:t>6.5.3 Code Efficiency</w:t>
       </w:r>
@@ -23262,7 +23366,7 @@
       <w:pPr>
         <w:pStyle w:val="RSubsubsection"/>
       </w:pPr>
-      <w:bookmarkStart w:id="107" w:name="_Toc244368950"/>
+      <w:bookmarkStart w:id="107" w:name="_Toc244369976"/>
       <w:r>
         <w:t>6.5.4 Optimization of Code</w:t>
       </w:r>
@@ -23318,7 +23422,7 @@
       <w:pPr>
         <w:pStyle w:val="RSubsubsection"/>
       </w:pPr>
-      <w:bookmarkStart w:id="108" w:name="_Toc244368951"/>
+      <w:bookmarkStart w:id="108" w:name="_Toc244369977"/>
       <w:r>
         <w:t>6.5.5 Validation Check</w:t>
       </w:r>
@@ -23336,7 +23440,7 @@
       <w:pPr>
         <w:pStyle w:val="RSection"/>
       </w:pPr>
-      <w:bookmarkStart w:id="109" w:name="_Toc244368952"/>
+      <w:bookmarkStart w:id="109" w:name="_Toc244369978"/>
       <w:r>
         <w:lastRenderedPageBreak/>
         <w:t>6.6 TESTING</w:t>
@@ -23347,7 +23451,7 @@
       <w:pPr>
         <w:pStyle w:val="RSubsubsection"/>
       </w:pPr>
-      <w:bookmarkStart w:id="110" w:name="_Toc244368953"/>
+      <w:bookmarkStart w:id="110" w:name="_Toc244369979"/>
       <w:r>
         <w:t>6.6.1 Testing Objectives</w:t>
       </w:r>
@@ -23365,7 +23469,7 @@
       <w:pPr>
         <w:pStyle w:val="RSubsubsection"/>
       </w:pPr>
-      <w:bookmarkStart w:id="111" w:name="_Toc244368954"/>
+      <w:bookmarkStart w:id="111" w:name="_Toc244369980"/>
       <w:r>
         <w:t>6.6.2 Testing Methods &amp; Strategies Used Along With Test Data</w:t>
       </w:r>
@@ -23393,7 +23497,7 @@
       <w:pPr>
         <w:pStyle w:val="RTblCaption"/>
       </w:pPr>
-      <w:bookmarkStart w:id="112" w:name="_Toc244369012"/>
+      <w:bookmarkStart w:id="112" w:name="_Toc244370038"/>
       <w:r>
         <w:rPr>
           <w:b/>
@@ -23989,7 +24093,7 @@
               <w:pStyle w:val="RTableText"/>
             </w:pPr>
             <w:r>
-              <w:t>End-to-end q003: 1944 clean, 1954 poisoned, 1944 defended</w:t>
+              <w:t>End-to-end q003 (stub poison, one call): 1944 clean, 1954 undefended, 1944 with the manifest</w:t>
             </w:r>
           </w:p>
         </w:tc>
@@ -24381,6 +24485,66 @@
           </w:p>
         </w:tc>
       </w:tr>
+      <w:tr>
+        <w:trPr>
+          <w:cantSplit/>
+          <w:jc w:val="center"/>
+        </w:trPr>
+        <w:tc>
+          <w:tcPr>
+            <w:tcW w:w="720" w:type="dxa"/>
+          </w:tcPr>
+          <w:p>
+            <w:pPr>
+              <w:pStyle w:val="RTableText"/>
+              <w:jc w:val="center"/>
+            </w:pPr>
+            <w:r>
+              <w:t>T15</w:t>
+            </w:r>
+          </w:p>
+        </w:tc>
+        <w:tc>
+          <w:tcPr>
+            <w:tcW w:w="4464" w:type="dxa"/>
+          </w:tcPr>
+          <w:p>
+            <w:pPr>
+              <w:pStyle w:val="RTableText"/>
+            </w:pPr>
+            <w:r>
+              <w:t>Single call: every defense answers one retrieval in a fixed order; with a tampered copy next to its original, near-duplicate abstention abstains and earliest-ingest-wins answers (stub reader)</w:t>
+            </w:r>
+          </w:p>
+        </w:tc>
+        <w:tc>
+          <w:tcPr>
+            <w:tcW w:w="2160" w:type="dxa"/>
+          </w:tcPr>
+          <w:p>
+            <w:pPr>
+              <w:pStyle w:val="RTableText"/>
+            </w:pPr>
+            <w:r>
+              <w:t>q003, tampered copies</w:t>
+            </w:r>
+          </w:p>
+        </w:tc>
+        <w:tc>
+          <w:tcPr>
+            <w:tcW w:w="965" w:type="dxa"/>
+          </w:tcPr>
+          <w:p>
+            <w:pPr>
+              <w:pStyle w:val="RTableText"/>
+              <w:jc w:val="center"/>
+            </w:pPr>
+            <w:r>
+              <w:t>Pass</w:t>
+            </w:r>
+          </w:p>
+        </w:tc>
+      </w:tr>
     </w:tbl>
     <w:p>
       <w:pPr>
@@ -24393,18 +24557,14 @@
         <w:pStyle w:val="RBody"/>
       </w:pPr>
       <w:r>
-        <w:t xml:space="preserve">T6 found a real defect during development: a sentence splitter broke "Glenn T. Seaborg" at the initial, so padding for question q004 leaked the correct answer. The </w:t>
-      </w:r>
-      <w:r>
-        <w:lastRenderedPageBreak/>
-        <w:t>splitter was changed to keep initials together and the padding check now runs on the joined text.</w:t>
+        <w:t>T6 found a real defect during development: a sentence splitter broke "Glenn T. Seaborg" at the initial, so padding for question q004 leaked the correct answer. The splitter was changed to keep initials together and the padding check now runs on the joined text.</w:t>
       </w:r>
     </w:p>
     <w:p>
       <w:pPr>
         <w:pStyle w:val="RChapter"/>
       </w:pPr>
-      <w:bookmarkStart w:id="113" w:name="_Toc244368955"/>
+      <w:bookmarkStart w:id="113" w:name="_Toc244369981"/>
       <w:r>
         <w:lastRenderedPageBreak/>
         <w:t>CHAPTER 7</w:t>
@@ -24419,7 +24579,7 @@
       <w:pPr>
         <w:pStyle w:val="RSection"/>
       </w:pPr>
-      <w:bookmarkStart w:id="114" w:name="_Toc244368956"/>
+      <w:bookmarkStart w:id="114" w:name="_Toc244369982"/>
       <w:r>
         <w:t>7.1 RESULTS</w:t>
       </w:r>
@@ -24429,7 +24589,7 @@
       <w:pPr>
         <w:pStyle w:val="RSubsubsection"/>
       </w:pPr>
-      <w:bookmarkStart w:id="115" w:name="_Toc244368957"/>
+      <w:bookmarkStart w:id="115" w:name="_Toc244369983"/>
       <w:r>
         <w:t>7.1.1 Experimental Setup</w:t>
       </w:r>
@@ -24457,7 +24617,7 @@
       <w:pPr>
         <w:pStyle w:val="RSubsubsection"/>
       </w:pPr>
-      <w:bookmarkStart w:id="116" w:name="_Toc244368958"/>
+      <w:bookmarkStart w:id="116" w:name="_Toc244369984"/>
       <w:r>
         <w:t>7.1.2 Clean Baseline</w:t>
       </w:r>
@@ -24467,7 +24627,7 @@
       <w:pPr>
         <w:pStyle w:val="RTblCaption"/>
       </w:pPr>
-      <w:bookmarkStart w:id="117" w:name="_Toc244369013"/>
+      <w:bookmarkStart w:id="117" w:name="_Toc244370039"/>
       <w:r>
         <w:rPr>
           <w:b/>
@@ -24675,7 +24835,7 @@
       <w:pPr>
         <w:pStyle w:val="RSubsubsection"/>
       </w:pPr>
-      <w:bookmarkStart w:id="118" w:name="_Toc244368959"/>
+      <w:bookmarkStart w:id="118" w:name="_Toc244369985"/>
       <w:r>
         <w:t>7.1.3 Effect of the Number of Poison Documents</w:t>
       </w:r>
@@ -24693,7 +24853,7 @@
       <w:pPr>
         <w:pStyle w:val="RTblCaption"/>
       </w:pPr>
-      <w:bookmarkStart w:id="119" w:name="_Toc244369014"/>
+      <w:bookmarkStart w:id="119" w:name="_Toc244370040"/>
       <w:r>
         <w:rPr>
           <w:b/>
@@ -25391,7 +25551,7 @@
       <w:pPr>
         <w:pStyle w:val="RFigCaption"/>
       </w:pPr>
-      <w:bookmarkStart w:id="120" w:name="_Toc244368991"/>
+      <w:bookmarkStart w:id="120" w:name="_Toc244370017"/>
       <w:r>
         <w:rPr>
           <w:b/>
@@ -25452,7 +25612,7 @@
       <w:pPr>
         <w:pStyle w:val="RFigCaption"/>
       </w:pPr>
-      <w:bookmarkStart w:id="121" w:name="_Toc244368992"/>
+      <w:bookmarkStart w:id="121" w:name="_Toc244370018"/>
       <w:r>
         <w:rPr>
           <w:b/>
@@ -25468,7 +25628,7 @@
       <w:pPr>
         <w:pStyle w:val="RSubsubsection"/>
       </w:pPr>
-      <w:bookmarkStart w:id="122" w:name="_Toc244368960"/>
+      <w:bookmarkStart w:id="122" w:name="_Toc244369986"/>
       <w:r>
         <w:t>7.1.4 Effect of Poison Style and Corpus Size</w:t>
       </w:r>
@@ -25486,7 +25646,7 @@
       <w:pPr>
         <w:pStyle w:val="RTblCaption"/>
       </w:pPr>
-      <w:bookmarkStart w:id="123" w:name="_Toc244369015"/>
+      <w:bookmarkStart w:id="123" w:name="_Toc244370041"/>
       <w:r>
         <w:rPr>
           <w:b/>
@@ -25918,7 +26078,7 @@
       <w:pPr>
         <w:pStyle w:val="RFigCaption"/>
       </w:pPr>
-      <w:bookmarkStart w:id="124" w:name="_Toc244368993"/>
+      <w:bookmarkStart w:id="124" w:name="_Toc244370019"/>
       <w:r>
         <w:rPr>
           <w:b/>
@@ -25934,7 +26094,7 @@
       <w:pPr>
         <w:pStyle w:val="RSubsubsection"/>
       </w:pPr>
-      <w:bookmarkStart w:id="125" w:name="_Toc244368961"/>
+      <w:bookmarkStart w:id="125" w:name="_Toc244369987"/>
       <w:r>
         <w:t>7.1.5 Defense Results</w:t>
       </w:r>
@@ -25952,7 +26112,7 @@
       <w:pPr>
         <w:pStyle w:val="RTblCaption"/>
       </w:pPr>
-      <w:bookmarkStart w:id="126" w:name="_Toc244369016"/>
+      <w:bookmarkStart w:id="126" w:name="_Toc244370042"/>
       <w:r>
         <w:rPr>
           <w:b/>
@@ -26862,7 +27022,7 @@
       <w:pPr>
         <w:pStyle w:val="RSubsubsection"/>
       </w:pPr>
-      <w:bookmarkStart w:id="127" w:name="_Toc244368962"/>
+      <w:bookmarkStart w:id="127" w:name="_Toc244369988"/>
       <w:r>
         <w:lastRenderedPageBreak/>
         <w:t>7.1.6 Adaptive Padded Attack</w:t>
@@ -26881,7 +27041,7 @@
       <w:pPr>
         <w:pStyle w:val="RTblCaption"/>
       </w:pPr>
-      <w:bookmarkStart w:id="128" w:name="_Toc244369017"/>
+      <w:bookmarkStart w:id="128" w:name="_Toc244370043"/>
       <w:r>
         <w:rPr>
           <w:b/>
@@ -27512,7 +27672,7 @@
       <w:pPr>
         <w:pStyle w:val="RSubsubsection"/>
       </w:pPr>
-      <w:bookmarkStart w:id="129" w:name="_Toc244368963"/>
+      <w:bookmarkStart w:id="129" w:name="_Toc244369989"/>
       <w:r>
         <w:t>7.1.7 Hash-Manifest Defense</w:t>
       </w:r>
@@ -27530,7 +27690,7 @@
       <w:pPr>
         <w:pStyle w:val="RTblCaption"/>
       </w:pPr>
-      <w:bookmarkStart w:id="130" w:name="_Toc244369018"/>
+      <w:bookmarkStart w:id="130" w:name="_Toc244370044"/>
       <w:r>
         <w:rPr>
           <w:b/>
@@ -28679,7 +28839,7 @@
       <w:pPr>
         <w:pStyle w:val="RFigCaption"/>
       </w:pPr>
-      <w:bookmarkStart w:id="131" w:name="_Toc244368994"/>
+      <w:bookmarkStart w:id="131" w:name="_Toc244370020"/>
       <w:r>
         <w:rPr>
           <w:b/>
@@ -28695,7 +28855,7 @@
       <w:pPr>
         <w:pStyle w:val="RSubsubsection"/>
       </w:pPr>
-      <w:bookmarkStart w:id="132" w:name="_Toc244368964"/>
+      <w:bookmarkStart w:id="132" w:name="_Toc244369990"/>
       <w:r>
         <w:t>7.1.8 Graded Provenance Strength</w:t>
       </w:r>
@@ -28717,7 +28877,7 @@
       <w:pPr>
         <w:pStyle w:val="RTblCaption"/>
       </w:pPr>
-      <w:bookmarkStart w:id="133" w:name="_Toc244369019"/>
+      <w:bookmarkStart w:id="133" w:name="_Toc244370045"/>
       <w:r>
         <w:rPr>
           <w:b/>
@@ -29408,7 +29568,7 @@
       <w:pPr>
         <w:pStyle w:val="RFigCaption"/>
       </w:pPr>
-      <w:bookmarkStart w:id="134" w:name="_Toc244368995"/>
+      <w:bookmarkStart w:id="134" w:name="_Toc244370021"/>
       <w:r>
         <w:rPr>
           <w:b/>
@@ -29424,7 +29584,7 @@
       <w:pPr>
         <w:pStyle w:val="RSubsubsection"/>
       </w:pPr>
-      <w:bookmarkStart w:id="135" w:name="_Toc244368965"/>
+      <w:bookmarkStart w:id="135" w:name="_Toc244369991"/>
       <w:r>
         <w:t>7.1.9 Tampered-Copy Attack</w:t>
       </w:r>
@@ -29446,7 +29606,7 @@
       <w:pPr>
         <w:pStyle w:val="RTblCaption"/>
       </w:pPr>
-      <w:bookmarkStart w:id="136" w:name="_Toc244369020"/>
+      <w:bookmarkStart w:id="136" w:name="_Toc244370046"/>
       <w:r>
         <w:rPr>
           <w:b/>
@@ -30876,7 +31036,7 @@
       <w:pPr>
         <w:pStyle w:val="RFigCaption"/>
       </w:pPr>
-      <w:bookmarkStart w:id="137" w:name="_Toc244368996"/>
+      <w:bookmarkStart w:id="137" w:name="_Toc244370022"/>
       <w:r>
         <w:rPr>
           <w:b/>
@@ -30892,7 +31052,7 @@
       <w:pPr>
         <w:pStyle w:val="RSubsubsection"/>
       </w:pPr>
-      <w:bookmarkStart w:id="138" w:name="_Toc244368966"/>
+      <w:bookmarkStart w:id="138" w:name="_Toc244369992"/>
       <w:r>
         <w:lastRenderedPageBreak/>
         <w:t>7.1.10 Near-Duplicate and Ingest-Order Defenses</w:t>
@@ -30911,7 +31071,7 @@
       <w:pPr>
         <w:pStyle w:val="RTblCaption"/>
       </w:pPr>
-      <w:bookmarkStart w:id="139" w:name="_Toc244369021"/>
+      <w:bookmarkStart w:id="139" w:name="_Toc244370047"/>
       <w:r>
         <w:rPr>
           <w:b/>
@@ -31284,7 +31444,7 @@
       <w:pPr>
         <w:pStyle w:val="RTblCaption"/>
       </w:pPr>
-      <w:bookmarkStart w:id="140" w:name="_Toc244369022"/>
+      <w:bookmarkStart w:id="140" w:name="_Toc244370048"/>
       <w:r>
         <w:rPr>
           <w:b/>
@@ -31906,7 +32066,7 @@
       <w:pPr>
         <w:pStyle w:val="RSection"/>
       </w:pPr>
-      <w:bookmarkStart w:id="141" w:name="_Toc244368967"/>
+      <w:bookmarkStart w:id="141" w:name="_Toc244369993"/>
       <w:r>
         <w:t>7.2 DISCUSSION</w:t>
       </w:r>
@@ -32079,7 +32239,7 @@
       <w:pPr>
         <w:pStyle w:val="RSection"/>
       </w:pPr>
-      <w:bookmarkStart w:id="142" w:name="_Toc244368968"/>
+      <w:bookmarkStart w:id="142" w:name="_Toc244369994"/>
       <w:r>
         <w:t>7.3 CONCLUSIONS</w:t>
       </w:r>
@@ -32186,7 +32346,7 @@
       <w:pPr>
         <w:pStyle w:val="RSection"/>
       </w:pPr>
-      <w:bookmarkStart w:id="143" w:name="_Toc244368969"/>
+      <w:bookmarkStart w:id="143" w:name="_Toc244369995"/>
       <w:r>
         <w:t>7.4 LIMITATION OF PROJECT</w:t>
       </w:r>
@@ -32305,7 +32465,7 @@
       <w:pPr>
         <w:pStyle w:val="RSection"/>
       </w:pPr>
-      <w:bookmarkStart w:id="144" w:name="_Toc244368970"/>
+      <w:bookmarkStart w:id="144" w:name="_Toc244369996"/>
       <w:r>
         <w:t>7.5 DIFFICULTIES ENCOUNTERED</w:t>
       </w:r>
@@ -32399,7 +32559,7 @@
       <w:pPr>
         <w:pStyle w:val="RSection"/>
       </w:pPr>
-      <w:bookmarkStart w:id="145" w:name="_Toc244368971"/>
+      <w:bookmarkStart w:id="145" w:name="_Toc244369997"/>
       <w:r>
         <w:t>7.6 FUTURE ENHANCEMENT SUGGESTIONS</w:t>
       </w:r>
@@ -32470,7 +32630,7 @@
       <w:pPr>
         <w:pStyle w:val="RChapter"/>
       </w:pPr>
-      <w:bookmarkStart w:id="146" w:name="_Toc244368972"/>
+      <w:bookmarkStart w:id="146" w:name="_Toc244369998"/>
       <w:r>
         <w:lastRenderedPageBreak/>
         <w:t>CHAPTER 8</w:t>
@@ -32485,7 +32645,7 @@
       <w:pPr>
         <w:pStyle w:val="RSection"/>
       </w:pPr>
-      <w:bookmarkStart w:id="147" w:name="_Toc244368973"/>
+      <w:bookmarkStart w:id="147" w:name="_Toc244369999"/>
       <w:r>
         <w:t>8.1 REFERENCE BOOKS</w:t>
       </w:r>
@@ -32552,7 +32712,7 @@
       <w:pPr>
         <w:pStyle w:val="RSection"/>
       </w:pPr>
-      <w:bookmarkStart w:id="148" w:name="_Toc244368974"/>
+      <w:bookmarkStart w:id="148" w:name="_Toc244370000"/>
       <w:r>
         <w:t>8.2 OTHER DOCUMENTATION &amp; RESOURCES</w:t>
       </w:r>
@@ -32829,7 +32989,7 @@
       <w:pPr>
         <w:pStyle w:val="RListTitle"/>
       </w:pPr>
-      <w:bookmarkStart w:id="149" w:name="_Toc244368975"/>
+      <w:bookmarkStart w:id="149" w:name="_Toc244370001"/>
       <w:r>
         <w:t>ANNEXURE I</w:t>
       </w:r>
@@ -32862,7 +33022,7 @@
         <w:t>python app.py</w:t>
       </w:r>
       <w:r>
-        <w:t xml:space="preserve"> and opened at http://127.0.0.1:7860. A dropdown selects one of the 50 questions and a radio button selects 1, 3, 5 or 10 poison documents, a second radio button selects the attacker (short stubs, poison padded to chunk length, or a tampered copy of a genuine chunk) and a dropdown selects the defense (provenance at 40, 30, 20 or 10 words, the hash manifest, the manifest regenerated after the poison, near-duplicate abstention, or earliest-ingest-wins). Four buttons are provided: ask without poison, inject poison and ask again, switch the selected defense on and ask again, and run all three together. The answer appears in three columns (clean, poisoned, defended) with a verdict (correct, attack succeeded, or neither) and a table of the top retrieved chunks that marks which chunks the defense dropped and which are poison. Below the columns the full results table is shown. For question q003 the clean answer is 1944, the poisoned answer 1954, and the defended answer 1944. With the padded attacker the provenance defense leaves the answer at 1954, while the hash manifest restores 1944. With the tampered attacker, question q015 shows the contrast: the answer flips from Dmitri Mendeleev to Marie Curie, earliest-ingest-wins restores it and the abstaining detector refuses to answer.</w:t>
+        <w:t xml:space="preserve"> and opened at http://127.0.0.1:7860. A dropdown selects one of the 50 questions, a radio button selects 1, 3, 5 or 10 poison documents, and a second radio button selects the attacker (short stubs, poison padded to chunk length, or a tampered copy of a genuine chunk). One button, Run all defenses, retrieves the candidate chunks once and lets every defense answer them: the undefended reader, the provenance filter at 10, 20, 30 and 40 words, the hash manifest, the manifest regenerated after the poison, near-duplicate abstention, earliest-ingest-wins and voting. A progress bar names the defense that is running (voting is the slow one when its answers are not cached) and the table fills in as each one finishes. The report states the correct answer and the attacker's target, lists the defenses that returned the correct answer and those that did not (with the reason: attack succeeded, abstained or neither), and the table gives every defense's answer next to the clean reference answer. Below it the full results table is shown. For question q003 with stub poison the undefended answer is 1954 against the clean 1944, and the hash manifest restores 1944. With the tampered attacker, question q015 shows the contrast: the answer flips from Dmitri Mendeleev to Marie Curie, and the manifest, earliest-ingest-wins and voting restore it, while the provenance filters and the manifest regenerated after the poison do not, and near-duplicate abstention refuses to answer.</w:t>
       </w:r>
     </w:p>
     <w:p>
@@ -32885,7 +33045,7 @@
       <w:pPr>
         <w:pStyle w:val="RListTitle"/>
       </w:pPr>
-      <w:bookmarkStart w:id="150" w:name="_Toc244368976"/>
+      <w:bookmarkStart w:id="150" w:name="_Toc244370002"/>
       <w:r>
         <w:t>ANNEXURE II</w:t>
       </w:r>
@@ -35243,10 +35403,6 @@
 </file>
 
 <file path=customXml/item1.xml><?xml version="1.0" encoding="utf-8"?>
-<b:Sources xmlns:b="http://schemas.openxmlformats.org/officeDocument/2006/bibliography" xmlns="http://schemas.openxmlformats.org/officeDocument/2006/bibliography" SelectedStyle="\APASixthEditionOfficeOnline.xsl" StyleName="APA" Version="6"/>
-</file>
-
-<file path=customXml/item2.xml><?xml version="1.0" encoding="utf-8"?>
 <s:customData xmlns="http://www.wps.cn/officeDocument/2013/wpsCustomData" xmlns:s="http://www.wps.cn/officeDocument/2013/wpsCustomData">
   <customSectProps/>
   <customShpExts>
@@ -35255,18 +35411,22 @@
 </s:customData>
 </file>
 
+<file path=customXml/item2.xml><?xml version="1.0" encoding="utf-8"?>
+<b:Sources xmlns:b="http://schemas.openxmlformats.org/officeDocument/2006/bibliography" xmlns="http://schemas.openxmlformats.org/officeDocument/2006/bibliography" SelectedStyle="\APASixthEditionOfficeOnline.xsl" StyleName="APA" Version="6"/>
+</file>
+
 <file path=customXml/itemProps1.xml><?xml version="1.0" encoding="utf-8"?>
+<ds:datastoreItem xmlns:ds="http://schemas.openxmlformats.org/officeDocument/2006/customXml" ds:itemID="{B1977F7D-205B-4081-913C-38D41E755F92}">
+  <ds:schemaRefs>
+    <ds:schemaRef ds:uri="http://www.wps.cn/officeDocument/2013/wpsCustomData"/>
+  </ds:schemaRefs>
+</ds:datastoreItem>
+</file>
+
+<file path=customXml/itemProps2.xml><?xml version="1.0" encoding="utf-8"?>
 <ds:datastoreItem xmlns:ds="http://schemas.openxmlformats.org/officeDocument/2006/customXml" ds:itemID="{45031021-E9EF-413F-9675-D33311C9F46E}">
   <ds:schemaRefs>
     <ds:schemaRef ds:uri="http://schemas.openxmlformats.org/officeDocument/2006/bibliography"/>
   </ds:schemaRefs>
 </ds:datastoreItem>
-</file>
-
-<file path=customXml/itemProps2.xml><?xml version="1.0" encoding="utf-8"?>
-<ds:datastoreItem xmlns:ds="http://schemas.openxmlformats.org/officeDocument/2006/customXml" ds:itemID="{B1977F7D-205B-4081-913C-38D41E755F92}">
-  <ds:schemaRefs>
-    <ds:schemaRef ds:uri="http://www.wps.cn/officeDocument/2013/wpsCustomData"/>
-  </ds:schemaRefs>
-</ds:datastoreItem>
 </file>
</xml_diff>